<commit_message>
İzlence revizyonu: tek ara jüri, ölçek temelli takvim, yeni ağırlıklar
- 27 Ekim yalnızca araştırma sunumları; ara jüri tek ve 1 Aralık'ta
- Takvimde atölye başlıkları kaldırıldı; ders konusu faz adı, teslim sütunu
  hangi alanın hangi ölçekte çalışılacağı olarak yazıldı (Bahçeşehir kalıbı)
- Kritik kuralı değişti: her ders günü en az bir kritik ve bir teslim zorunlu
- Devam: her ders günü sabah ve öğleden sonra olmak üzere iki kez imza
- Ağırlıklar: araştırma sunumu %15, ara jüri %30, final %40, süreç %15
- Başarı koşulu eklendi: en az 60 puan (CC)
- Not dönüşüm tablosu AA-FF ölçeğine çevrildi
- 10 Kasım dipnotu kaldırıldı

Co-Authored-By: Claude Opus 5 <noreply@anthropic.com>
Claude-Session: https://claude.ai/code/session_012829GnztWNW7AgpXkSZZYk
</commit_message>
<xml_diff>
--- a/magaza-tasarimi-dersi/IcMimariProje3-Ders-Izlencesi-2026-2027-Guz.docx
+++ b/magaza-tasarimi-dersi/IcMimariProje3-Ders-Izlencesi-2026-2027-Guz.docx
@@ -2179,7 +2179,7 @@
                 <w:sz w:val="21"/>
                 <w:szCs w:val="21"/>
               </w:rPr>
-              <w:t xml:space="preserve">Kritik alma zorunluluğu</w:t>
+              <w:t xml:space="preserve">Kritik ve teslim zorunluluğu</w:t>
             </w:r>
           </w:p>
           <w:p>
@@ -2192,7 +2192,7 @@
                 <w:sz w:val="19"/>
                 <w:szCs w:val="19"/>
               </w:rPr>
-              <w:t xml:space="preserve">Her ders günü en az iki kritik almak zorunludur: biri sabah seansında (09.30–12.30), biri öğleden sonra seansında (13.30–17.30). Kritikler yürütücü tarafından kayıt altına alınır ve stüdyo süreç performansı notuna doğrudan yansır. Kritik alabilmek için o haftanın çalışmasının çizim, eskiz, maket ya da dijital çıktı olarak hazır bulundurulması gerekir; elinde işi olmayan öğrenci kritik almış sayılmaz.</w:t>
+              <w:t xml:space="preserve">Her ders günü en az bir kritik almak ve bir teslim yapmak zorunludur. Teslim, o hafta için takvimde belirtilen çalışmanın çizim, eskiz, maket ya da dijital çıktı olarak stüdyoda hazır bulundurulmasıdır. Elinde işi olmayan öğrenci kritik almış sayılmaz. Kritikler ve teslimler yürütücü tarafından kayıt altına alınır ve stüdyo süreç performansı notuna doğrudan yansır.</w:t>
             </w:r>
           </w:p>
         </w:tc>
@@ -2719,7 +2719,7 @@
           <w:sz w:val="20"/>
           <w:szCs w:val="20"/>
         </w:rPr>
-        <w:t xml:space="preserve">Her hafta (ara jüri ve final jürisi günleri dâhil) ıslak imza alınır. İmza listesini imzalamak ve takip etmek öğrencinin sorumluluğundadır.</w:t>
+        <w:t xml:space="preserve">Her ders günü, biri sabah biri öğleden sonra seansında olmak üzere iki kez ıslak imza alınır (araştırma sunumu, ara jüri ve final jürisi günleri dâhil). İmza listelerini imzalamak ve takip etmek öğrencinin sorumluluğundadır.</w:t>
       </w:r>
     </w:p>
     <w:p>
@@ -2842,6 +2842,27 @@
           <w:szCs w:val="20"/>
         </w:rPr>
         <w:t xml:space="preserve">Kendi kritiğiniz dışında diğer kritikleri de dinlemeniz önemle tavsiye edilir.</w:t>
+      </w:r>
+    </w:p>
+    <w:p>
+      <w:pPr>
+        <w:pStyle w:val="ListParagraph"/>
+        <w:numPr>
+          <w:ilvl w:val="0"/>
+          <w:numId w:val="3"/>
+        </w:numPr>
+        <w:spacing w:after="60" w:line="264"/>
+      </w:pPr>
+      <w:r>
+        <w:rPr>
+          <w:rFonts w:ascii="Calibri" w:cs="Calibri" w:eastAsia="Calibri" w:hAnsi="Calibri"/>
+          <w:b w:val="false"/>
+          <w:bCs w:val="false"/>
+          <w:color w:val="1A1A1A"/>
+          <w:sz w:val="20"/>
+          <w:szCs w:val="20"/>
+        </w:rPr>
+        <w:t xml:space="preserve">Haftalık teslimini yapmayan öğrenci o gün için kritik almamış sayılır; bu durum süreç performansı notuna yansır.</w:t>
       </w:r>
     </w:p>
     <w:p>
@@ -3227,7 +3248,7 @@
                 <w:sz w:val="18"/>
                 <w:szCs w:val="18"/>
               </w:rPr>
-              <w:t xml:space="preserve">5. hafta · 27 Ekim · sabah seansı</w:t>
+              <w:t xml:space="preserve">5. hafta · 27 Ekim 2026</w:t>
             </w:r>
           </w:p>
         </w:tc>
@@ -3283,7 +3304,7 @@
                 <w:sz w:val="18"/>
                 <w:szCs w:val="18"/>
               </w:rPr>
-              <w:t xml:space="preserve">%5</w:t>
+              <w:t xml:space="preserve">%15</w:t>
             </w:r>
           </w:p>
         </w:tc>
@@ -3315,7 +3336,7 @@
                 <w:sz w:val="18"/>
                 <w:szCs w:val="18"/>
               </w:rPr>
-              <w:t xml:space="preserve">1. Ara Jüri</w:t>
+              <w:t xml:space="preserve">Ara Jüri</w:t>
             </w:r>
           </w:p>
         </w:tc>
@@ -3343,7 +3364,7 @@
                 <w:sz w:val="18"/>
                 <w:szCs w:val="18"/>
               </w:rPr>
-              <w:t xml:space="preserve">5. hafta · 27 Ekim · öğleden sonra seansı</w:t>
+              <w:t xml:space="preserve">10. hafta · 1 Aralık 2026</w:t>
             </w:r>
           </w:p>
         </w:tc>
@@ -3401,7 +3422,7 @@
                 <w:sz w:val="18"/>
                 <w:szCs w:val="18"/>
               </w:rPr>
-              <w:t xml:space="preserve">%20</w:t>
+              <w:t xml:space="preserve">%30</w:t>
             </w:r>
           </w:p>
         </w:tc>
@@ -3432,7 +3453,7 @@
                 <w:sz w:val="18"/>
                 <w:szCs w:val="18"/>
               </w:rPr>
-              <w:t xml:space="preserve">2. Ara Jüri</w:t>
+              <w:t xml:space="preserve">Final Jürisi</w:t>
             </w:r>
           </w:p>
         </w:tc>
@@ -3459,7 +3480,7 @@
                 <w:sz w:val="18"/>
                 <w:szCs w:val="18"/>
               </w:rPr>
-              <w:t xml:space="preserve">10. hafta · 1 Aralık</w:t>
+              <w:t xml:space="preserve">Final sınav haftası · tarih fakülte takvimiyle duyurulacak</w:t>
             </w:r>
           </w:p>
         </w:tc>
@@ -3515,7 +3536,7 @@
                 <w:sz w:val="18"/>
                 <w:szCs w:val="18"/>
               </w:rPr>
-              <w:t xml:space="preserve">%25</w:t>
+              <w:t xml:space="preserve">%40</w:t>
             </w:r>
           </w:p>
         </w:tc>
@@ -3547,7 +3568,7 @@
                 <w:sz w:val="18"/>
                 <w:szCs w:val="18"/>
               </w:rPr>
-              <w:t xml:space="preserve">Final Jürisi</w:t>
+              <w:t xml:space="preserve">Stüdyo Süreç Performansı</w:t>
             </w:r>
           </w:p>
         </w:tc>
@@ -3575,7 +3596,7 @@
                 <w:sz w:val="18"/>
                 <w:szCs w:val="18"/>
               </w:rPr>
-              <w:t xml:space="preserve">Final sınav haftası · tarih fakülte takvimiyle duyurulacak</w:t>
+              <w:t xml:space="preserve">Yarıyıl boyunca kritik ve teslim düzenliliği, katılım ve gelişim</w:t>
             </w:r>
           </w:p>
         </w:tc>
@@ -3633,7 +3654,7 @@
                 <w:sz w:val="18"/>
                 <w:szCs w:val="18"/>
               </w:rPr>
-              <w:t xml:space="preserve">%40</w:t>
+              <w:t xml:space="preserve">%15</w:t>
             </w:r>
           </w:p>
         </w:tc>
@@ -3642,6 +3663,7 @@
         <w:tc>
           <w:tcPr>
             <w:tcW w:type="dxa" w:w="3400"/>
+            <w:shd w:fill="E8EBEE" w:color="auto" w:val="clear"/>
             <w:tcMar>
               <w:top w:type="dxa" w:w="70"/>
               <w:left w:type="dxa" w:w="110"/>
@@ -3664,13 +3686,14 @@
                 <w:sz w:val="18"/>
                 <w:szCs w:val="18"/>
               </w:rPr>
-              <w:t xml:space="preserve">Stüdyo Süreç Performansı</w:t>
+              <w:t xml:space="preserve">TOPLAM</w:t>
             </w:r>
           </w:p>
         </w:tc>
         <w:tc>
           <w:tcPr>
             <w:tcW w:type="dxa" w:w="3438"/>
+            <w:shd w:fill="E8EBEE" w:color="auto" w:val="clear"/>
             <w:tcMar>
               <w:top w:type="dxa" w:w="70"/>
               <w:left w:type="dxa" w:w="110"/>
@@ -3691,13 +3714,14 @@
                 <w:sz w:val="18"/>
                 <w:szCs w:val="18"/>
               </w:rPr>
-              <w:t xml:space="preserve">Yarıyıl boyunca kritik alma düzenliliği, katılım ve gelişim</w:t>
+              <w:t xml:space="preserve"/>
             </w:r>
           </w:p>
         </w:tc>
         <w:tc>
           <w:tcPr>
             <w:tcW w:type="dxa" w:w="1200"/>
+            <w:shd w:fill="E8EBEE" w:color="auto" w:val="clear"/>
             <w:tcMar>
               <w:top w:type="dxa" w:w="70"/>
               <w:left w:type="dxa" w:w="110"/>
@@ -3718,13 +3742,14 @@
                 <w:sz w:val="18"/>
                 <w:szCs w:val="18"/>
               </w:rPr>
-              <w:t xml:space="preserve">100</w:t>
+              <w:t xml:space="preserve">—</w:t>
             </w:r>
           </w:p>
         </w:tc>
         <w:tc>
           <w:tcPr>
             <w:tcW w:type="dxa" w:w="1600"/>
+            <w:shd w:fill="E8EBEE" w:color="auto" w:val="clear"/>
             <w:tcMar>
               <w:top w:type="dxa" w:w="70"/>
               <w:left w:type="dxa" w:w="110"/>
@@ -3747,130 +3772,81 @@
                 <w:sz w:val="18"/>
                 <w:szCs w:val="18"/>
               </w:rPr>
-              <w:t xml:space="preserve">%10</w:t>
+              <w:t xml:space="preserve">%100</w:t>
             </w:r>
           </w:p>
         </w:tc>
       </w:tr>
+    </w:tbl>
+    <w:p>
+      <w:pPr>
+        <w:spacing w:after="140"/>
+      </w:pPr>
+    </w:p>
+    <w:tbl>
+      <w:tblPr>
+        <w:tblW w:type="dxa" w:w="9638"/>
+        <w:tblBorders>
+          <w:top w:val="single" w:color="8C3A2B" w:sz="2"/>
+          <w:left w:val="single" w:color="8C3A2B" w:sz="18"/>
+          <w:bottom w:val="single" w:color="8C3A2B" w:sz="2"/>
+          <w:right w:val="single" w:color="8C3A2B" w:sz="2"/>
+          <w:insideH w:val="none" w:color="auto" w:sz="0"/>
+          <w:insideV w:val="none" w:color="auto" w:sz="0"/>
+        </w:tblBorders>
+      </w:tblPr>
+      <w:tblGrid>
+        <w:gridCol w:w="9638"/>
+      </w:tblGrid>
       <w:tr>
         <w:tc>
           <w:tcPr>
-            <w:tcW w:type="dxa" w:w="3400"/>
-            <w:shd w:fill="E8EBEE" w:color="auto" w:val="clear"/>
-            <w:tcMar>
-              <w:top w:type="dxa" w:w="70"/>
-              <w:left w:type="dxa" w:w="110"/>
-              <w:bottom w:type="dxa" w:w="70"/>
-              <w:right w:type="dxa" w:w="110"/>
-            </w:tcMar>
-            <w:vAlign w:val="top"/>
-          </w:tcPr>
-          <w:p>
-            <w:pPr>
-              <w:spacing w:after="0" w:line="250"/>
-              <w:jc w:val="left"/>
+            <w:tcW w:type="dxa" w:w="9638"/>
+            <w:shd w:fill="F6EAE6" w:color="auto" w:val="clear"/>
+            <w:tcMar>
+              <w:top w:type="dxa" w:w="130"/>
+              <w:left w:type="dxa" w:w="200"/>
+              <w:bottom w:type="dxa" w:w="130"/>
+              <w:right w:type="dxa" w:w="160"/>
+            </w:tcMar>
+          </w:tcPr>
+          <w:p>
+            <w:pPr>
+              <w:spacing w:after="70"/>
             </w:pPr>
             <w:r>
               <w:rPr>
                 <w:rFonts w:ascii="Calibri" w:cs="Calibri" w:eastAsia="Calibri" w:hAnsi="Calibri"/>
                 <w:b/>
                 <w:bCs/>
-                <w:color w:val="1A1A1A"/>
-                <w:sz w:val="18"/>
-                <w:szCs w:val="18"/>
-              </w:rPr>
-              <w:t xml:space="preserve">TOPLAM</w:t>
-            </w:r>
-          </w:p>
-        </w:tc>
-        <w:tc>
-          <w:tcPr>
-            <w:tcW w:type="dxa" w:w="3438"/>
-            <w:shd w:fill="E8EBEE" w:color="auto" w:val="clear"/>
-            <w:tcMar>
-              <w:top w:type="dxa" w:w="70"/>
-              <w:left w:type="dxa" w:w="110"/>
-              <w:bottom w:type="dxa" w:w="70"/>
-              <w:right w:type="dxa" w:w="110"/>
-            </w:tcMar>
-            <w:vAlign w:val="top"/>
-          </w:tcPr>
-          <w:p>
-            <w:pPr>
-              <w:spacing w:after="0" w:line="250"/>
-              <w:jc w:val="left"/>
-            </w:pPr>
-            <w:r>
-              <w:rPr>
-                <w:rFonts w:ascii="Calibri" w:cs="Calibri" w:eastAsia="Calibri" w:hAnsi="Calibri"/>
-                <w:color w:val="1A1A1A"/>
-                <w:sz w:val="18"/>
-                <w:szCs w:val="18"/>
-              </w:rPr>
-              <w:t xml:space="preserve"/>
-            </w:r>
-          </w:p>
-        </w:tc>
-        <w:tc>
-          <w:tcPr>
-            <w:tcW w:type="dxa" w:w="1200"/>
-            <w:shd w:fill="E8EBEE" w:color="auto" w:val="clear"/>
-            <w:tcMar>
-              <w:top w:type="dxa" w:w="70"/>
-              <w:left w:type="dxa" w:w="110"/>
-              <w:bottom w:type="dxa" w:w="70"/>
-              <w:right w:type="dxa" w:w="110"/>
-            </w:tcMar>
-            <w:vAlign w:val="top"/>
-          </w:tcPr>
-          <w:p>
-            <w:pPr>
-              <w:spacing w:after="0" w:line="250"/>
-              <w:jc w:val="center"/>
-            </w:pPr>
-            <w:r>
-              <w:rPr>
-                <w:rFonts w:ascii="Calibri" w:cs="Calibri" w:eastAsia="Calibri" w:hAnsi="Calibri"/>
-                <w:color w:val="1A1A1A"/>
-                <w:sz w:val="18"/>
-                <w:szCs w:val="18"/>
-              </w:rPr>
-              <w:t xml:space="preserve">—</w:t>
-            </w:r>
-          </w:p>
-        </w:tc>
-        <w:tc>
-          <w:tcPr>
-            <w:tcW w:type="dxa" w:w="1600"/>
-            <w:shd w:fill="E8EBEE" w:color="auto" w:val="clear"/>
-            <w:tcMar>
-              <w:top w:type="dxa" w:w="70"/>
-              <w:left w:type="dxa" w:w="110"/>
-              <w:bottom w:type="dxa" w:w="70"/>
-              <w:right w:type="dxa" w:w="110"/>
-            </w:tcMar>
-            <w:vAlign w:val="top"/>
-          </w:tcPr>
-          <w:p>
-            <w:pPr>
-              <w:spacing w:after="0" w:line="250"/>
-              <w:jc w:val="center"/>
-            </w:pPr>
-            <w:r>
-              <w:rPr>
-                <w:rFonts w:ascii="Calibri" w:cs="Calibri" w:eastAsia="Calibri" w:hAnsi="Calibri"/>
-                <w:b/>
-                <w:bCs/>
-                <w:color w:val="1A1A1A"/>
-                <w:sz w:val="18"/>
-                <w:szCs w:val="18"/>
-              </w:rPr>
-              <w:t xml:space="preserve">%100</w:t>
+                <w:color w:val="8C3A2B"/>
+                <w:sz w:val="21"/>
+                <w:szCs w:val="21"/>
+              </w:rPr>
+              <w:t xml:space="preserve">Başarı koşulu</w:t>
+            </w:r>
+          </w:p>
+          <w:p>
+            <w:pPr>
+              <w:spacing w:after="0" w:line="270"/>
+            </w:pPr>
+            <w:r>
+              <w:rPr>
+                <w:rFonts w:ascii="Calibri" w:cs="Calibri" w:eastAsia="Calibri" w:hAnsi="Calibri"/>
+                <w:sz w:val="19"/>
+                <w:szCs w:val="19"/>
+              </w:rPr>
+              <w:t xml:space="preserve">Dersten başarılı sayılmak için yarıyıl sonu başarı notunun en az 60 puan olması gerekir. 60 puan CC harf notuna karşılık gelir. Bu puanın altında kalan öğrenci, jürilere katılmış olsa dahi dersten başarısız sayılır.</w:t>
             </w:r>
           </w:p>
         </w:tc>
       </w:tr>
     </w:tbl>
+    <w:p>
+      <w:pPr>
+        <w:spacing w:after="140"/>
+      </w:pPr>
+    </w:p>
     <w:p>
       <w:pPr>
         <w:pStyle w:val="Heading2"/>
@@ -4164,7 +4140,7 @@
                 <w:sz w:val="18"/>
                 <w:szCs w:val="18"/>
               </w:rPr>
-              <w:t xml:space="preserve">Tanışma, izlence ve proje brifi</w:t>
+              <w:t xml:space="preserve">Oryantasyon</w:t>
             </w:r>
           </w:p>
         </w:tc>
@@ -4191,7 +4167,7 @@
                 <w:sz w:val="17"/>
                 <w:szCs w:val="17"/>
               </w:rPr>
-              <w:t xml:space="preserve">Sabah: İzlence anlatımı, ders kuralları, proje brifi</w:t>
+              <w:t xml:space="preserve">Ders akışı, izlence ve ders kuralları</w:t>
             </w:r>
           </w:p>
           <w:p>
@@ -4206,22 +4182,37 @@
                 <w:sz w:val="17"/>
                 <w:szCs w:val="17"/>
               </w:rPr>
-              <w:t xml:space="preserve">Sabah: Teorik sunum — Marka anahtarı, kullanıcı profili ve müşteri yolculuğu</w:t>
-            </w:r>
-          </w:p>
-          <w:p>
-            <w:pPr>
-              <w:spacing w:after="0" w:line="250"/>
-              <w:jc w:val="left"/>
-            </w:pPr>
-            <w:r>
-              <w:rPr>
-                <w:rFonts w:ascii="Calibri" w:cs="Calibri" w:eastAsia="Calibri" w:hAnsi="Calibri"/>
-                <w:color w:val="1A1A1A"/>
-                <w:sz w:val="17"/>
-                <w:szCs w:val="17"/>
-              </w:rPr>
-              <w:t xml:space="preserve">Öğleden sonra: Atölye — mağaza okuma çalışması ve grup tartışması</w:t>
+              <w:t xml:space="preserve">Proje brifi</w:t>
+            </w:r>
+          </w:p>
+          <w:p>
+            <w:pPr>
+              <w:spacing w:after="40" w:line="250"/>
+              <w:jc w:val="left"/>
+            </w:pPr>
+            <w:r>
+              <w:rPr>
+                <w:rFonts w:ascii="Calibri" w:cs="Calibri" w:eastAsia="Calibri" w:hAnsi="Calibri"/>
+                <w:color w:val="1A1A1A"/>
+                <w:sz w:val="17"/>
+                <w:szCs w:val="17"/>
+              </w:rPr>
+              <w:t xml:space="preserve">Teorik anlatım: marka kimliği, kullanıcı profili ve müşteri yolculuğu</w:t>
+            </w:r>
+          </w:p>
+          <w:p>
+            <w:pPr>
+              <w:spacing w:after="0" w:line="250"/>
+              <w:jc w:val="left"/>
+            </w:pPr>
+            <w:r>
+              <w:rPr>
+                <w:rFonts w:ascii="Calibri" w:cs="Calibri" w:eastAsia="Calibri" w:hAnsi="Calibri"/>
+                <w:color w:val="1A1A1A"/>
+                <w:sz w:val="17"/>
+                <w:szCs w:val="17"/>
+              </w:rPr>
+              <w:t xml:space="preserve">Sınıf içi çalışma ve tartışma</w:t>
             </w:r>
           </w:p>
         </w:tc>
@@ -4372,7 +4363,7 @@
                 <w:sz w:val="18"/>
                 <w:szCs w:val="18"/>
               </w:rPr>
-              <w:t xml:space="preserve">Alan gezisi</w:t>
+              <w:t xml:space="preserve">Alan Gezisi</w:t>
             </w:r>
           </w:p>
         </w:tc>
@@ -4400,7 +4391,7 @@
                 <w:sz w:val="17"/>
                 <w:szCs w:val="17"/>
               </w:rPr>
-              <w:t xml:space="preserve">Tüm gün: Mersin Marina'da yerinde inceleme; ölçü, fotoğraf, yaya akışı, çevre ve komşu birim gözlemi</w:t>
+              <w:t xml:space="preserve">Alanın yerinde incelenmesi: ölçü, fotoğraf, yaya akışı, yön, manzara, gün ışığı, komşu birimler</w:t>
             </w:r>
           </w:p>
           <w:p>
@@ -4443,7 +4434,7 @@
                 <w:sz w:val="17"/>
                 <w:szCs w:val="17"/>
               </w:rPr>
-              <w:t xml:space="preserve">Alan analizi paftası</w:t>
+              <w:t xml:space="preserve">Alan analizi</w:t>
             </w:r>
           </w:p>
           <w:p>
@@ -4458,7 +4449,7 @@
                 <w:sz w:val="17"/>
                 <w:szCs w:val="17"/>
               </w:rPr>
-              <w:t xml:space="preserve">Seçilen marka için marka anahtarı ve üç persona</w:t>
+              <w:t xml:space="preserve">Marka anahtarı ve kullanıcı profili</w:t>
             </w:r>
           </w:p>
           <w:p>
@@ -4548,7 +4539,7 @@
                 <w:sz w:val="18"/>
                 <w:szCs w:val="18"/>
               </w:rPr>
-              <w:t xml:space="preserve">Alan analizi ve marka analizi</w:t>
+              <w:t xml:space="preserve">Araştırma, Analiz ve Konsept Geliştirme</w:t>
             </w:r>
           </w:p>
         </w:tc>
@@ -4565,6 +4556,33 @@
           </w:tcPr>
           <w:p>
             <w:pPr>
+              <w:spacing w:after="0" w:line="250"/>
+              <w:jc w:val="left"/>
+            </w:pPr>
+            <w:r>
+              <w:rPr>
+                <w:rFonts w:ascii="Calibri" w:cs="Calibri" w:eastAsia="Calibri" w:hAnsi="Calibri"/>
+                <w:color w:val="1A1A1A"/>
+                <w:sz w:val="17"/>
+                <w:szCs w:val="17"/>
+              </w:rPr>
+              <w:t xml:space="preserve">Kritikler</w:t>
+            </w:r>
+          </w:p>
+        </w:tc>
+        <w:tc>
+          <w:tcPr>
+            <w:tcW w:type="dxa" w:w="2794"/>
+            <w:tcMar>
+              <w:top w:type="dxa" w:w="70"/>
+              <w:left w:type="dxa" w:w="110"/>
+              <w:bottom w:type="dxa" w:w="70"/>
+              <w:right w:type="dxa" w:w="110"/>
+            </w:tcMar>
+            <w:vAlign w:val="top"/>
+          </w:tcPr>
+          <w:p>
+            <w:pPr>
               <w:spacing w:after="40" w:line="250"/>
               <w:jc w:val="left"/>
             </w:pPr>
@@ -4575,36 +4593,9 @@
                 <w:sz w:val="17"/>
                 <w:szCs w:val="17"/>
               </w:rPr>
-              <w:t xml:space="preserve">Kritikler: alan analizi, marka anahtarı, kullanıcı profili</w:t>
-            </w:r>
-          </w:p>
-          <w:p>
-            <w:pPr>
-              <w:spacing w:after="0" w:line="250"/>
-              <w:jc w:val="left"/>
-            </w:pPr>
-            <w:r>
-              <w:rPr>
-                <w:rFonts w:ascii="Calibri" w:cs="Calibri" w:eastAsia="Calibri" w:hAnsi="Calibri"/>
-                <w:color w:val="1A1A1A"/>
-                <w:sz w:val="17"/>
-                <w:szCs w:val="17"/>
-              </w:rPr>
-              <w:t xml:space="preserve">Kritikler: müşteri yolculuğu haritası — sekiz aşama</w:t>
-            </w:r>
-          </w:p>
-        </w:tc>
-        <w:tc>
-          <w:tcPr>
-            <w:tcW w:type="dxa" w:w="2794"/>
-            <w:tcMar>
-              <w:top w:type="dxa" w:w="70"/>
-              <w:left w:type="dxa" w:w="110"/>
-              <w:bottom w:type="dxa" w:w="70"/>
-              <w:right w:type="dxa" w:w="110"/>
-            </w:tcMar>
-            <w:vAlign w:val="top"/>
-          </w:tcPr>
+              <w:t xml:space="preserve">Alan analizi paftaları</w:t>
+            </w:r>
+          </w:p>
           <w:p>
             <w:pPr>
               <w:spacing w:after="40" w:line="250"/>
@@ -4617,22 +4608,37 @@
                 <w:sz w:val="17"/>
                 <w:szCs w:val="17"/>
               </w:rPr>
-              <w:t xml:space="preserve">Üç anahtar kelime ve gerekçeleri</w:t>
-            </w:r>
-          </w:p>
-          <w:p>
-            <w:pPr>
-              <w:spacing w:after="0" w:line="250"/>
-              <w:jc w:val="left"/>
-            </w:pPr>
-            <w:r>
-              <w:rPr>
-                <w:rFonts w:ascii="Calibri" w:cs="Calibri" w:eastAsia="Calibri" w:hAnsi="Calibri"/>
-                <w:color w:val="1A1A1A"/>
-                <w:sz w:val="17"/>
-                <w:szCs w:val="17"/>
-              </w:rPr>
-              <w:t xml:space="preserve">Mekânsal program ve m² dağılımı</w:t>
+              <w:t xml:space="preserve">Marka anahtarı</w:t>
+            </w:r>
+          </w:p>
+          <w:p>
+            <w:pPr>
+              <w:spacing w:after="40" w:line="250"/>
+              <w:jc w:val="left"/>
+            </w:pPr>
+            <w:r>
+              <w:rPr>
+                <w:rFonts w:ascii="Calibri" w:cs="Calibri" w:eastAsia="Calibri" w:hAnsi="Calibri"/>
+                <w:color w:val="1A1A1A"/>
+                <w:sz w:val="17"/>
+                <w:szCs w:val="17"/>
+              </w:rPr>
+              <w:t xml:space="preserve">Kullanıcı profili</w:t>
+            </w:r>
+          </w:p>
+          <w:p>
+            <w:pPr>
+              <w:spacing w:after="0" w:line="250"/>
+              <w:jc w:val="left"/>
+            </w:pPr>
+            <w:r>
+              <w:rPr>
+                <w:rFonts w:ascii="Calibri" w:cs="Calibri" w:eastAsia="Calibri" w:hAnsi="Calibri"/>
+                <w:color w:val="1A1A1A"/>
+                <w:sz w:val="17"/>
+                <w:szCs w:val="17"/>
+              </w:rPr>
+              <w:t xml:space="preserve">Müşteri yolculuğu haritası</w:t>
             </w:r>
           </w:p>
         </w:tc>
@@ -4709,7 +4715,7 @@
                 <w:sz w:val="18"/>
                 <w:szCs w:val="18"/>
               </w:rPr>
-              <w:t xml:space="preserve">Konsept geliştirme ve zoning</w:t>
+              <w:t xml:space="preserve">Araştırma, Analiz ve Konsept Geliştirme</w:t>
             </w:r>
           </w:p>
         </w:tc>
@@ -4727,32 +4733,17 @@
           </w:tcPr>
           <w:p>
             <w:pPr>
-              <w:spacing w:after="40" w:line="250"/>
-              <w:jc w:val="left"/>
-            </w:pPr>
-            <w:r>
-              <w:rPr>
-                <w:rFonts w:ascii="Calibri" w:cs="Calibri" w:eastAsia="Calibri" w:hAnsi="Calibri"/>
-                <w:color w:val="1A1A1A"/>
-                <w:sz w:val="17"/>
-                <w:szCs w:val="17"/>
-              </w:rPr>
-              <w:t xml:space="preserve">Kritikler: anahtar kelime → mekânsal ilke → tasarım öğesi zinciri</w:t>
-            </w:r>
-          </w:p>
-          <w:p>
-            <w:pPr>
-              <w:spacing w:after="0" w:line="250"/>
-              <w:jc w:val="left"/>
-            </w:pPr>
-            <w:r>
-              <w:rPr>
-                <w:rFonts w:ascii="Calibri" w:cs="Calibri" w:eastAsia="Calibri" w:hAnsi="Calibri"/>
-                <w:color w:val="1A1A1A"/>
-                <w:sz w:val="17"/>
-                <w:szCs w:val="17"/>
-              </w:rPr>
-              <w:t xml:space="preserve">Kritikler: zoning şeması, ön alan ve arka alan ilişkisi, konsept panosu</w:t>
+              <w:spacing w:after="0" w:line="250"/>
+              <w:jc w:val="left"/>
+            </w:pPr>
+            <w:r>
+              <w:rPr>
+                <w:rFonts w:ascii="Calibri" w:cs="Calibri" w:eastAsia="Calibri" w:hAnsi="Calibri"/>
+                <w:color w:val="1A1A1A"/>
+                <w:sz w:val="17"/>
+                <w:szCs w:val="17"/>
+              </w:rPr>
+              <w:t xml:space="preserve">Kritikler</w:t>
             </w:r>
           </w:p>
         </w:tc>
@@ -4780,38 +4771,9 @@
                 <w:sz w:val="17"/>
                 <w:szCs w:val="17"/>
               </w:rPr>
-              <w:t xml:space="preserve">1. Ara Jüri paftalarının hazırlanması</w:t>
-            </w:r>
-          </w:p>
-          <w:p>
-            <w:pPr>
-              <w:spacing w:after="0" w:line="250"/>
-              <w:jc w:val="left"/>
-            </w:pPr>
-            <w:r>
-              <w:rPr>
-                <w:rFonts w:ascii="Calibri" w:cs="Calibri" w:eastAsia="Calibri" w:hAnsi="Calibri"/>
-                <w:color w:val="1A1A1A"/>
-                <w:sz w:val="17"/>
-                <w:szCs w:val="17"/>
-              </w:rPr>
-              <w:t xml:space="preserve">1/100 zoning planı ve kesit</w:t>
-            </w:r>
-          </w:p>
-        </w:tc>
-      </w:tr>
-      <w:tr>
-        <w:tc>
-          <w:tcPr>
-            <w:tcW w:type="dxa" w:w="1750"/>
-            <w:tcMar>
-              <w:top w:type="dxa" w:w="70"/>
-              <w:left w:type="dxa" w:w="110"/>
-              <w:bottom w:type="dxa" w:w="70"/>
-              <w:right w:type="dxa" w:w="110"/>
-            </w:tcMar>
-            <w:vAlign w:val="top"/>
-          </w:tcPr>
+              <w:t xml:space="preserve">Üç anahtar kelime ve gerekçeleri</w:t>
+            </w:r>
+          </w:p>
           <w:p>
             <w:pPr>
               <w:spacing w:after="40" w:line="250"/>
@@ -4820,770 +4782,26 @@
             <w:r>
               <w:rPr>
                 <w:rFonts w:ascii="Calibri" w:cs="Calibri" w:eastAsia="Calibri" w:hAnsi="Calibri"/>
-                <w:b/>
-                <w:bCs/>
-                <w:color w:val="1A1A1A"/>
-                <w:sz w:val="17"/>
-                <w:szCs w:val="17"/>
-              </w:rPr>
-              <w:t xml:space="preserve">5. Hafta</w:t>
-            </w:r>
-          </w:p>
-          <w:p>
-            <w:pPr>
-              <w:spacing w:after="0" w:line="250"/>
-              <w:jc w:val="left"/>
-            </w:pPr>
-            <w:r>
-              <w:rPr>
-                <w:rFonts w:ascii="Calibri" w:cs="Calibri" w:eastAsia="Calibri" w:hAnsi="Calibri"/>
-                <w:b w:val="false"/>
-                <w:bCs w:val="false"/>
-                <w:color w:val="1A1A1A"/>
-                <w:sz w:val="17"/>
-                <w:szCs w:val="17"/>
-              </w:rPr>
-              <w:t xml:space="preserve">27 Ekim 2026 · Salı</w:t>
-            </w:r>
-          </w:p>
-        </w:tc>
-        <w:tc>
-          <w:tcPr>
-            <w:tcW w:type="dxa" w:w="2300"/>
-            <w:tcMar>
-              <w:top w:type="dxa" w:w="70"/>
-              <w:left w:type="dxa" w:w="110"/>
-              <w:bottom w:type="dxa" w:w="70"/>
-              <w:right w:type="dxa" w:w="110"/>
-            </w:tcMar>
-            <w:vAlign w:val="top"/>
-          </w:tcPr>
-          <w:p>
-            <w:pPr>
-              <w:spacing w:after="0" w:line="250"/>
-              <w:jc w:val="left"/>
-            </w:pPr>
-            <w:r>
-              <w:rPr>
-                <w:rFonts w:ascii="Calibri" w:cs="Calibri" w:eastAsia="Calibri" w:hAnsi="Calibri"/>
-                <w:color w:val="1A1A1A"/>
-                <w:sz w:val="18"/>
-                <w:szCs w:val="18"/>
-              </w:rPr>
-              <w:t xml:space="preserve">ARAŞTIRMA SUNUMLARI ve 1. ARA JÜRİ</w:t>
-            </w:r>
-          </w:p>
-        </w:tc>
-        <w:tc>
-          <w:tcPr>
-            <w:tcW w:type="dxa" w:w="2794"/>
-            <w:tcMar>
-              <w:top w:type="dxa" w:w="70"/>
-              <w:left w:type="dxa" w:w="110"/>
-              <w:bottom w:type="dxa" w:w="70"/>
-              <w:right w:type="dxa" w:w="110"/>
-            </w:tcMar>
-            <w:vAlign w:val="top"/>
-          </w:tcPr>
-          <w:p>
-            <w:pPr>
-              <w:spacing w:after="40" w:line="250"/>
-              <w:jc w:val="left"/>
-            </w:pPr>
-            <w:r>
-              <w:rPr>
-                <w:rFonts w:ascii="Calibri" w:cs="Calibri" w:eastAsia="Calibri" w:hAnsi="Calibri"/>
-                <w:color w:val="1A1A1A"/>
-                <w:sz w:val="17"/>
-                <w:szCs w:val="17"/>
-              </w:rPr>
-              <w:t xml:space="preserve">Sabah: Araştırma sunumları — tüm stüdyo önünde, marka, kullanıcı ve yolculuk analizi</w:t>
-            </w:r>
-          </w:p>
-          <w:p>
-            <w:pPr>
-              <w:spacing w:after="0" w:line="250"/>
-              <w:jc w:val="left"/>
-            </w:pPr>
-            <w:r>
-              <w:rPr>
-                <w:rFonts w:ascii="Calibri" w:cs="Calibri" w:eastAsia="Calibri" w:hAnsi="Calibri"/>
-                <w:color w:val="1A1A1A"/>
-                <w:sz w:val="17"/>
-                <w:szCs w:val="17"/>
-              </w:rPr>
-              <w:t xml:space="preserve">Öğleden sonra: 1. Ara Jüri — konsept sunumları ve değerlendirme</w:t>
-            </w:r>
-          </w:p>
-        </w:tc>
-        <w:tc>
-          <w:tcPr>
-            <w:tcW w:type="dxa" w:w="2794"/>
-            <w:tcMar>
-              <w:top w:type="dxa" w:w="70"/>
-              <w:left w:type="dxa" w:w="110"/>
-              <w:bottom w:type="dxa" w:w="70"/>
-              <w:right w:type="dxa" w:w="110"/>
-            </w:tcMar>
-            <w:vAlign w:val="top"/>
-          </w:tcPr>
-          <w:p>
-            <w:pPr>
-              <w:spacing w:after="0" w:line="250"/>
-              <w:jc w:val="left"/>
-            </w:pPr>
-            <w:r>
-              <w:rPr>
-                <w:rFonts w:ascii="Calibri" w:cs="Calibri" w:eastAsia="Calibri" w:hAnsi="Calibri"/>
-                <w:color w:val="1A1A1A"/>
-                <w:sz w:val="17"/>
-                <w:szCs w:val="17"/>
-              </w:rPr>
-              <w:t xml:space="preserve">Teslim: araştırma dosyası, konsept panosu, senaryo, anahtar kelime matrisi, 1/100 zoning planı ve kesit</w:t>
-            </w:r>
-          </w:p>
-        </w:tc>
-      </w:tr>
-      <w:tr>
-        <w:tc>
-          <w:tcPr>
-            <w:tcW w:type="dxa" w:w="1750"/>
-            <w:shd w:fill="F2F4F6" w:color="auto" w:val="clear"/>
-            <w:tcMar>
-              <w:top w:type="dxa" w:w="70"/>
-              <w:left w:type="dxa" w:w="110"/>
-              <w:bottom w:type="dxa" w:w="70"/>
-              <w:right w:type="dxa" w:w="110"/>
-            </w:tcMar>
-            <w:vAlign w:val="top"/>
-          </w:tcPr>
-          <w:p>
-            <w:pPr>
-              <w:spacing w:after="40" w:line="250"/>
-              <w:jc w:val="left"/>
-            </w:pPr>
-            <w:r>
-              <w:rPr>
-                <w:rFonts w:ascii="Calibri" w:cs="Calibri" w:eastAsia="Calibri" w:hAnsi="Calibri"/>
-                <w:b/>
-                <w:bCs/>
-                <w:color w:val="1A1A1A"/>
-                <w:sz w:val="17"/>
-                <w:szCs w:val="17"/>
-              </w:rPr>
-              <w:t xml:space="preserve">6. Hafta</w:t>
-            </w:r>
-          </w:p>
-          <w:p>
-            <w:pPr>
-              <w:spacing w:after="0" w:line="250"/>
-              <w:jc w:val="left"/>
-            </w:pPr>
-            <w:r>
-              <w:rPr>
-                <w:rFonts w:ascii="Calibri" w:cs="Calibri" w:eastAsia="Calibri" w:hAnsi="Calibri"/>
-                <w:b w:val="false"/>
-                <w:bCs w:val="false"/>
-                <w:color w:val="1A1A1A"/>
-                <w:sz w:val="17"/>
-                <w:szCs w:val="17"/>
-              </w:rPr>
-              <w:t xml:space="preserve">3 Kasım 2026 · Salı</w:t>
-            </w:r>
-          </w:p>
-        </w:tc>
-        <w:tc>
-          <w:tcPr>
-            <w:tcW w:type="dxa" w:w="2300"/>
-            <w:shd w:fill="F2F4F6" w:color="auto" w:val="clear"/>
-            <w:tcMar>
-              <w:top w:type="dxa" w:w="70"/>
-              <w:left w:type="dxa" w:w="110"/>
-              <w:bottom w:type="dxa" w:w="70"/>
-              <w:right w:type="dxa" w:w="110"/>
-            </w:tcMar>
-            <w:vAlign w:val="top"/>
-          </w:tcPr>
-          <w:p>
-            <w:pPr>
-              <w:spacing w:after="0" w:line="250"/>
-              <w:jc w:val="left"/>
-            </w:pPr>
-            <w:r>
-              <w:rPr>
-                <w:rFonts w:ascii="Calibri" w:cs="Calibri" w:eastAsia="Calibri" w:hAnsi="Calibri"/>
-                <w:color w:val="1A1A1A"/>
-                <w:sz w:val="18"/>
-                <w:szCs w:val="18"/>
-              </w:rPr>
-              <w:t xml:space="preserve">Tasarım geliştirme I — plan kurgusu</w:t>
-            </w:r>
-          </w:p>
-        </w:tc>
-        <w:tc>
-          <w:tcPr>
-            <w:tcW w:type="dxa" w:w="2794"/>
-            <w:shd w:fill="F2F4F6" w:color="auto" w:val="clear"/>
-            <w:tcMar>
-              <w:top w:type="dxa" w:w="70"/>
-              <w:left w:type="dxa" w:w="110"/>
-              <w:bottom w:type="dxa" w:w="70"/>
-              <w:right w:type="dxa" w:w="110"/>
-            </w:tcMar>
-            <w:vAlign w:val="top"/>
-          </w:tcPr>
-          <w:p>
-            <w:pPr>
-              <w:spacing w:after="40" w:line="250"/>
-              <w:jc w:val="left"/>
-            </w:pPr>
-            <w:r>
-              <w:rPr>
-                <w:rFonts w:ascii="Calibri" w:cs="Calibri" w:eastAsia="Calibri" w:hAnsi="Calibri"/>
-                <w:color w:val="1A1A1A"/>
-                <w:sz w:val="17"/>
-                <w:szCs w:val="17"/>
-              </w:rPr>
-              <w:t xml:space="preserve">Kritikler: mekânsal program, dolaşım, görüş hatları</w:t>
-            </w:r>
-          </w:p>
-          <w:p>
-            <w:pPr>
-              <w:spacing w:after="0" w:line="250"/>
-              <w:jc w:val="left"/>
-            </w:pPr>
-            <w:r>
-              <w:rPr>
-                <w:rFonts w:ascii="Calibri" w:cs="Calibri" w:eastAsia="Calibri" w:hAnsi="Calibri"/>
-                <w:color w:val="1A1A1A"/>
-                <w:sz w:val="17"/>
-                <w:szCs w:val="17"/>
-              </w:rPr>
-              <w:t xml:space="preserve">Kritikler: müşteri ve personel rotalarının ayrılması</w:t>
-            </w:r>
-          </w:p>
-        </w:tc>
-        <w:tc>
-          <w:tcPr>
-            <w:tcW w:type="dxa" w:w="2794"/>
-            <w:shd w:fill="F2F4F6" w:color="auto" w:val="clear"/>
-            <w:tcMar>
-              <w:top w:type="dxa" w:w="70"/>
-              <w:left w:type="dxa" w:w="110"/>
-              <w:bottom w:type="dxa" w:w="70"/>
-              <w:right w:type="dxa" w:w="110"/>
-            </w:tcMar>
-            <w:vAlign w:val="top"/>
-          </w:tcPr>
-          <w:p>
-            <w:pPr>
-              <w:spacing w:after="40" w:line="250"/>
-              <w:jc w:val="left"/>
-            </w:pPr>
-            <w:r>
-              <w:rPr>
-                <w:rFonts w:ascii="Calibri" w:cs="Calibri" w:eastAsia="Calibri" w:hAnsi="Calibri"/>
-                <w:color w:val="1A1A1A"/>
-                <w:sz w:val="17"/>
-                <w:szCs w:val="17"/>
-              </w:rPr>
-              <w:t xml:space="preserve">1/50 plan ve en az iki kesit</w:t>
-            </w:r>
-          </w:p>
-          <w:p>
-            <w:pPr>
-              <w:spacing w:after="0" w:line="250"/>
-              <w:jc w:val="left"/>
-            </w:pPr>
-            <w:r>
-              <w:rPr>
-                <w:rFonts w:ascii="Calibri" w:cs="Calibri" w:eastAsia="Calibri" w:hAnsi="Calibri"/>
-                <w:color w:val="1A1A1A"/>
-                <w:sz w:val="17"/>
-                <w:szCs w:val="17"/>
-              </w:rPr>
-              <w:t xml:space="preserve">Kavramsal 3B model</w:t>
-            </w:r>
-          </w:p>
-        </w:tc>
-      </w:tr>
-      <w:tr>
-        <w:tc>
-          <w:tcPr>
-            <w:tcW w:type="dxa" w:w="1750"/>
-            <w:tcMar>
-              <w:top w:type="dxa" w:w="70"/>
-              <w:left w:type="dxa" w:w="110"/>
-              <w:bottom w:type="dxa" w:w="70"/>
-              <w:right w:type="dxa" w:w="110"/>
-            </w:tcMar>
-            <w:vAlign w:val="top"/>
-          </w:tcPr>
-          <w:p>
-            <w:pPr>
-              <w:spacing w:after="40" w:line="250"/>
-              <w:jc w:val="left"/>
-            </w:pPr>
-            <w:r>
-              <w:rPr>
-                <w:rFonts w:ascii="Calibri" w:cs="Calibri" w:eastAsia="Calibri" w:hAnsi="Calibri"/>
-                <w:b/>
-                <w:bCs/>
-                <w:color w:val="1A1A1A"/>
-                <w:sz w:val="17"/>
-                <w:szCs w:val="17"/>
-              </w:rPr>
-              <w:t xml:space="preserve">7. Hafta</w:t>
-            </w:r>
-          </w:p>
-          <w:p>
-            <w:pPr>
-              <w:spacing w:after="0" w:line="250"/>
-              <w:jc w:val="left"/>
-            </w:pPr>
-            <w:r>
-              <w:rPr>
-                <w:rFonts w:ascii="Calibri" w:cs="Calibri" w:eastAsia="Calibri" w:hAnsi="Calibri"/>
-                <w:b w:val="false"/>
-                <w:bCs w:val="false"/>
-                <w:color w:val="1A1A1A"/>
-                <w:sz w:val="17"/>
-                <w:szCs w:val="17"/>
-              </w:rPr>
-              <w:t xml:space="preserve">10 Kasım 2026 · Salı</w:t>
-            </w:r>
-          </w:p>
-        </w:tc>
-        <w:tc>
-          <w:tcPr>
-            <w:tcW w:type="dxa" w:w="2300"/>
-            <w:tcMar>
-              <w:top w:type="dxa" w:w="70"/>
-              <w:left w:type="dxa" w:w="110"/>
-              <w:bottom w:type="dxa" w:w="70"/>
-              <w:right w:type="dxa" w:w="110"/>
-            </w:tcMar>
-            <w:vAlign w:val="top"/>
-          </w:tcPr>
-          <w:p>
-            <w:pPr>
-              <w:spacing w:after="0" w:line="250"/>
-              <w:jc w:val="left"/>
-            </w:pPr>
-            <w:r>
-              <w:rPr>
-                <w:rFonts w:ascii="Calibri" w:cs="Calibri" w:eastAsia="Calibri" w:hAnsi="Calibri"/>
-                <w:color w:val="1A1A1A"/>
-                <w:sz w:val="18"/>
-                <w:szCs w:val="18"/>
-              </w:rPr>
-              <w:t xml:space="preserve">Atölye — Çekim ve eşik: cephe, vitrin, giriş</w:t>
-            </w:r>
-          </w:p>
-        </w:tc>
-        <w:tc>
-          <w:tcPr>
-            <w:tcW w:type="dxa" w:w="2794"/>
-            <w:tcMar>
-              <w:top w:type="dxa" w:w="70"/>
-              <w:left w:type="dxa" w:w="110"/>
-              <w:bottom w:type="dxa" w:w="70"/>
-              <w:right w:type="dxa" w:w="110"/>
-            </w:tcMar>
-            <w:vAlign w:val="top"/>
-          </w:tcPr>
-          <w:p>
-            <w:pPr>
-              <w:spacing w:after="40" w:line="250"/>
-              <w:jc w:val="left"/>
-            </w:pPr>
-            <w:r>
-              <w:rPr>
-                <w:rFonts w:ascii="Calibri" w:cs="Calibri" w:eastAsia="Calibri" w:hAnsi="Calibri"/>
-                <w:color w:val="1A1A1A"/>
-                <w:sz w:val="17"/>
-                <w:szCs w:val="17"/>
-              </w:rPr>
-              <w:t xml:space="preserve">Atölye: üç mesafeden cephe okuması, vitrin tipleri, eşik ve geçiş bölgesi</w:t>
-            </w:r>
-          </w:p>
-          <w:p>
-            <w:pPr>
-              <w:spacing w:after="0" w:line="250"/>
-              <w:jc w:val="left"/>
-            </w:pPr>
-            <w:r>
-              <w:rPr>
-                <w:rFonts w:ascii="Calibri" w:cs="Calibri" w:eastAsia="Calibri" w:hAnsi="Calibri"/>
-                <w:color w:val="1A1A1A"/>
-                <w:sz w:val="17"/>
-                <w:szCs w:val="17"/>
-              </w:rPr>
-              <w:t xml:space="preserve">Kritikler: cephe ve vitrin önerileri</w:t>
-            </w:r>
-          </w:p>
-        </w:tc>
-        <w:tc>
-          <w:tcPr>
-            <w:tcW w:type="dxa" w:w="2794"/>
-            <w:tcMar>
-              <w:top w:type="dxa" w:w="70"/>
-              <w:left w:type="dxa" w:w="110"/>
-              <w:bottom w:type="dxa" w:w="70"/>
-              <w:right w:type="dxa" w:w="110"/>
-            </w:tcMar>
-            <w:vAlign w:val="top"/>
-          </w:tcPr>
-          <w:p>
-            <w:pPr>
-              <w:spacing w:after="40" w:line="250"/>
-              <w:jc w:val="left"/>
-            </w:pPr>
-            <w:r>
-              <w:rPr>
-                <w:rFonts w:ascii="Calibri" w:cs="Calibri" w:eastAsia="Calibri" w:hAnsi="Calibri"/>
-                <w:color w:val="1A1A1A"/>
-                <w:sz w:val="17"/>
-                <w:szCs w:val="17"/>
-              </w:rPr>
-              <w:t xml:space="preserve">1/50 cephe ve vitrin çalışması</w:t>
-            </w:r>
-          </w:p>
-          <w:p>
-            <w:pPr>
-              <w:spacing w:after="0" w:line="250"/>
-              <w:jc w:val="left"/>
-            </w:pPr>
-            <w:r>
-              <w:rPr>
-                <w:rFonts w:ascii="Calibri" w:cs="Calibri" w:eastAsia="Calibri" w:hAnsi="Calibri"/>
-                <w:color w:val="1A1A1A"/>
-                <w:sz w:val="17"/>
-                <w:szCs w:val="17"/>
-              </w:rPr>
-              <w:t xml:space="preserve">Güncellenmiş plan ve kesitler</w:t>
-            </w:r>
-          </w:p>
-        </w:tc>
-      </w:tr>
-      <w:tr>
-        <w:tc>
-          <w:tcPr>
-            <w:tcW w:type="dxa" w:w="1750"/>
-            <w:shd w:fill="F2F4F6" w:color="auto" w:val="clear"/>
-            <w:tcMar>
-              <w:top w:type="dxa" w:w="70"/>
-              <w:left w:type="dxa" w:w="110"/>
-              <w:bottom w:type="dxa" w:w="70"/>
-              <w:right w:type="dxa" w:w="110"/>
-            </w:tcMar>
-            <w:vAlign w:val="top"/>
-          </w:tcPr>
-          <w:p>
-            <w:pPr>
-              <w:spacing w:after="40" w:line="250"/>
-              <w:jc w:val="left"/>
-            </w:pPr>
-            <w:r>
-              <w:rPr>
-                <w:rFonts w:ascii="Calibri" w:cs="Calibri" w:eastAsia="Calibri" w:hAnsi="Calibri"/>
-                <w:b/>
-                <w:bCs/>
-                <w:color w:val="1A1A1A"/>
-                <w:sz w:val="17"/>
-                <w:szCs w:val="17"/>
-              </w:rPr>
-              <w:t xml:space="preserve">8. Hafta</w:t>
-            </w:r>
-          </w:p>
-          <w:p>
-            <w:pPr>
-              <w:spacing w:after="0" w:line="250"/>
-              <w:jc w:val="left"/>
-            </w:pPr>
-            <w:r>
-              <w:rPr>
-                <w:rFonts w:ascii="Calibri" w:cs="Calibri" w:eastAsia="Calibri" w:hAnsi="Calibri"/>
-                <w:b w:val="false"/>
-                <w:bCs w:val="false"/>
-                <w:color w:val="1A1A1A"/>
-                <w:sz w:val="17"/>
-                <w:szCs w:val="17"/>
-              </w:rPr>
-              <w:t xml:space="preserve">17 Kasım 2026 · Salı</w:t>
-            </w:r>
-          </w:p>
-        </w:tc>
-        <w:tc>
-          <w:tcPr>
-            <w:tcW w:type="dxa" w:w="2300"/>
-            <w:shd w:fill="F2F4F6" w:color="auto" w:val="clear"/>
-            <w:tcMar>
-              <w:top w:type="dxa" w:w="70"/>
-              <w:left w:type="dxa" w:w="110"/>
-              <w:bottom w:type="dxa" w:w="70"/>
-              <w:right w:type="dxa" w:w="110"/>
-            </w:tcMar>
-            <w:vAlign w:val="top"/>
-          </w:tcPr>
-          <w:p>
-            <w:pPr>
-              <w:spacing w:after="0" w:line="250"/>
-              <w:jc w:val="left"/>
-            </w:pPr>
-            <w:r>
-              <w:rPr>
-                <w:rFonts w:ascii="Calibri" w:cs="Calibri" w:eastAsia="Calibri" w:hAnsi="Calibri"/>
-                <w:color w:val="1A1A1A"/>
-                <w:sz w:val="18"/>
-                <w:szCs w:val="18"/>
-              </w:rPr>
-              <w:t xml:space="preserve">Atölye — Organizasyonel çözüm ve ergonomi</w:t>
-            </w:r>
-          </w:p>
-        </w:tc>
-        <w:tc>
-          <w:tcPr>
-            <w:tcW w:type="dxa" w:w="2794"/>
-            <w:shd w:fill="F2F4F6" w:color="auto" w:val="clear"/>
-            <w:tcMar>
-              <w:top w:type="dxa" w:w="70"/>
-              <w:left w:type="dxa" w:w="110"/>
-              <w:bottom w:type="dxa" w:w="70"/>
-              <w:right w:type="dxa" w:w="110"/>
-            </w:tcMar>
-            <w:vAlign w:val="top"/>
-          </w:tcPr>
-          <w:p>
-            <w:pPr>
-              <w:spacing w:after="40" w:line="250"/>
-              <w:jc w:val="left"/>
-            </w:pPr>
-            <w:r>
-              <w:rPr>
-                <w:rFonts w:ascii="Calibri" w:cs="Calibri" w:eastAsia="Calibri" w:hAnsi="Calibri"/>
-                <w:color w:val="1A1A1A"/>
-                <w:sz w:val="17"/>
-                <w:szCs w:val="17"/>
-              </w:rPr>
-              <w:t xml:space="preserve">Atölye: kasa ve kasa arkası, depo metrekare hesabı, servis rotası, erişilebilirlik</w:t>
-            </w:r>
-          </w:p>
-          <w:p>
-            <w:pPr>
-              <w:spacing w:after="0" w:line="250"/>
-              <w:jc w:val="left"/>
-            </w:pPr>
-            <w:r>
-              <w:rPr>
-                <w:rFonts w:ascii="Calibri" w:cs="Calibri" w:eastAsia="Calibri" w:hAnsi="Calibri"/>
-                <w:color w:val="1A1A1A"/>
-                <w:sz w:val="17"/>
-                <w:szCs w:val="17"/>
-              </w:rPr>
-              <w:t xml:space="preserve">Kritikler: arka alan çözümü</w:t>
-            </w:r>
-          </w:p>
-        </w:tc>
-        <w:tc>
-          <w:tcPr>
-            <w:tcW w:type="dxa" w:w="2794"/>
-            <w:shd w:fill="F2F4F6" w:color="auto" w:val="clear"/>
-            <w:tcMar>
-              <w:top w:type="dxa" w:w="70"/>
-              <w:left w:type="dxa" w:w="110"/>
-              <w:bottom w:type="dxa" w:w="70"/>
-              <w:right w:type="dxa" w:w="110"/>
-            </w:tcMar>
-            <w:vAlign w:val="top"/>
-          </w:tcPr>
-          <w:p>
-            <w:pPr>
-              <w:spacing w:after="40" w:line="250"/>
-              <w:jc w:val="left"/>
-            </w:pPr>
-            <w:r>
-              <w:rPr>
-                <w:rFonts w:ascii="Calibri" w:cs="Calibri" w:eastAsia="Calibri" w:hAnsi="Calibri"/>
-                <w:color w:val="1A1A1A"/>
-                <w:sz w:val="17"/>
-                <w:szCs w:val="17"/>
-              </w:rPr>
-              <w:t xml:space="preserve">Gerekçelendirilmiş depo çözümü</w:t>
-            </w:r>
-          </w:p>
-          <w:p>
-            <w:pPr>
-              <w:spacing w:after="0" w:line="250"/>
-              <w:jc w:val="left"/>
-            </w:pPr>
-            <w:r>
-              <w:rPr>
-                <w:rFonts w:ascii="Calibri" w:cs="Calibri" w:eastAsia="Calibri" w:hAnsi="Calibri"/>
-                <w:color w:val="1A1A1A"/>
-                <w:sz w:val="17"/>
-                <w:szCs w:val="17"/>
-              </w:rPr>
-              <w:t xml:space="preserve">Güncellenmiş 1/50 set</w:t>
-            </w:r>
-          </w:p>
-        </w:tc>
-      </w:tr>
-      <w:tr>
-        <w:tc>
-          <w:tcPr>
-            <w:tcW w:type="dxa" w:w="1750"/>
-            <w:tcMar>
-              <w:top w:type="dxa" w:w="70"/>
-              <w:left w:type="dxa" w:w="110"/>
-              <w:bottom w:type="dxa" w:w="70"/>
-              <w:right w:type="dxa" w:w="110"/>
-            </w:tcMar>
-            <w:vAlign w:val="top"/>
-          </w:tcPr>
-          <w:p>
-            <w:pPr>
-              <w:spacing w:after="40" w:line="250"/>
-              <w:jc w:val="left"/>
-            </w:pPr>
-            <w:r>
-              <w:rPr>
-                <w:rFonts w:ascii="Calibri" w:cs="Calibri" w:eastAsia="Calibri" w:hAnsi="Calibri"/>
-                <w:b/>
-                <w:bCs/>
-                <w:color w:val="1A1A1A"/>
-                <w:sz w:val="17"/>
-                <w:szCs w:val="17"/>
-              </w:rPr>
-              <w:t xml:space="preserve">9. Hafta</w:t>
-            </w:r>
-          </w:p>
-          <w:p>
-            <w:pPr>
-              <w:spacing w:after="0" w:line="250"/>
-              <w:jc w:val="left"/>
-            </w:pPr>
-            <w:r>
-              <w:rPr>
-                <w:rFonts w:ascii="Calibri" w:cs="Calibri" w:eastAsia="Calibri" w:hAnsi="Calibri"/>
-                <w:b w:val="false"/>
-                <w:bCs w:val="false"/>
-                <w:color w:val="1A1A1A"/>
-                <w:sz w:val="17"/>
-                <w:szCs w:val="17"/>
-              </w:rPr>
-              <w:t xml:space="preserve">24 Kasım 2026 · Salı</w:t>
-            </w:r>
-          </w:p>
-        </w:tc>
-        <w:tc>
-          <w:tcPr>
-            <w:tcW w:type="dxa" w:w="2300"/>
-            <w:tcMar>
-              <w:top w:type="dxa" w:w="70"/>
-              <w:left w:type="dxa" w:w="110"/>
-              <w:bottom w:type="dxa" w:w="70"/>
-              <w:right w:type="dxa" w:w="110"/>
-            </w:tcMar>
-            <w:vAlign w:val="top"/>
-          </w:tcPr>
-          <w:p>
-            <w:pPr>
-              <w:spacing w:after="0" w:line="250"/>
-              <w:jc w:val="left"/>
-            </w:pPr>
-            <w:r>
-              <w:rPr>
-                <w:rFonts w:ascii="Calibri" w:cs="Calibri" w:eastAsia="Calibri" w:hAnsi="Calibri"/>
-                <w:color w:val="1A1A1A"/>
-                <w:sz w:val="18"/>
-                <w:szCs w:val="18"/>
-              </w:rPr>
-              <w:t xml:space="preserve">Tasarım geliştirme II — atmosfer ve duyular</w:t>
-            </w:r>
-          </w:p>
-        </w:tc>
-        <w:tc>
-          <w:tcPr>
-            <w:tcW w:type="dxa" w:w="2794"/>
-            <w:tcMar>
-              <w:top w:type="dxa" w:w="70"/>
-              <w:left w:type="dxa" w:w="110"/>
-              <w:bottom w:type="dxa" w:w="70"/>
-              <w:right w:type="dxa" w:w="110"/>
-            </w:tcMar>
-            <w:vAlign w:val="top"/>
-          </w:tcPr>
-          <w:p>
-            <w:pPr>
-              <w:spacing w:after="40" w:line="250"/>
-              <w:jc w:val="left"/>
-            </w:pPr>
-            <w:r>
-              <w:rPr>
-                <w:rFonts w:ascii="Calibri" w:cs="Calibri" w:eastAsia="Calibri" w:hAnsi="Calibri"/>
-                <w:color w:val="1A1A1A"/>
-                <w:sz w:val="17"/>
-                <w:szCs w:val="17"/>
-              </w:rPr>
-              <w:t xml:space="preserve">Kritikler: malzeme, ışık, renk, doku</w:t>
-            </w:r>
-          </w:p>
-          <w:p>
-            <w:pPr>
-              <w:spacing w:after="0" w:line="250"/>
-              <w:jc w:val="left"/>
-            </w:pPr>
-            <w:r>
-              <w:rPr>
-                <w:rFonts w:ascii="Calibri" w:cs="Calibri" w:eastAsia="Calibri" w:hAnsi="Calibri"/>
-                <w:color w:val="1A1A1A"/>
-                <w:sz w:val="17"/>
-                <w:szCs w:val="17"/>
-              </w:rPr>
-              <w:t xml:space="preserve">Kritikler: duyu–yolculuk matrisi ve üç imza an</w:t>
-            </w:r>
-          </w:p>
-        </w:tc>
-        <w:tc>
-          <w:tcPr>
-            <w:tcW w:type="dxa" w:w="2794"/>
-            <w:tcMar>
-              <w:top w:type="dxa" w:w="70"/>
-              <w:left w:type="dxa" w:w="110"/>
-              <w:bottom w:type="dxa" w:w="70"/>
-              <w:right w:type="dxa" w:w="110"/>
-            </w:tcMar>
-            <w:vAlign w:val="top"/>
-          </w:tcPr>
-          <w:p>
-            <w:pPr>
-              <w:spacing w:after="40" w:line="250"/>
-              <w:jc w:val="left"/>
-            </w:pPr>
-            <w:r>
-              <w:rPr>
-                <w:rFonts w:ascii="Calibri" w:cs="Calibri" w:eastAsia="Calibri" w:hAnsi="Calibri"/>
-                <w:color w:val="1A1A1A"/>
-                <w:sz w:val="17"/>
-                <w:szCs w:val="17"/>
-              </w:rPr>
-              <w:t xml:space="preserve">2. Ara Jüri paftalarının hazırlanması</w:t>
-            </w:r>
-          </w:p>
-          <w:p>
-            <w:pPr>
-              <w:spacing w:after="0" w:line="250"/>
-              <w:jc w:val="left"/>
-            </w:pPr>
-            <w:r>
-              <w:rPr>
-                <w:rFonts w:ascii="Calibri" w:cs="Calibri" w:eastAsia="Calibri" w:hAnsi="Calibri"/>
-                <w:color w:val="1A1A1A"/>
-                <w:sz w:val="17"/>
-                <w:szCs w:val="17"/>
-              </w:rPr>
-              <w:t xml:space="preserve">Malzeme paneli ve aydınlatma kurgusu</w:t>
+                <w:color w:val="1A1A1A"/>
+                <w:sz w:val="17"/>
+                <w:szCs w:val="17"/>
+              </w:rPr>
+              <w:t xml:space="preserve">Mekânsal program ve m² dağılımı</w:t>
+            </w:r>
+          </w:p>
+          <w:p>
+            <w:pPr>
+              <w:spacing w:after="0" w:line="250"/>
+              <w:jc w:val="left"/>
+            </w:pPr>
+            <w:r>
+              <w:rPr>
+                <w:rFonts w:ascii="Calibri" w:cs="Calibri" w:eastAsia="Calibri" w:hAnsi="Calibri"/>
+                <w:color w:val="1A1A1A"/>
+                <w:sz w:val="17"/>
+                <w:szCs w:val="17"/>
+              </w:rPr>
+              <w:t xml:space="preserve">Senaryo ve konsept panosu</w:t>
             </w:r>
           </w:p>
         </w:tc>
@@ -5615,7 +4833,7 @@
                 <w:sz w:val="17"/>
                 <w:szCs w:val="17"/>
               </w:rPr>
-              <w:t xml:space="preserve">10. Hafta</w:t>
+              <w:t xml:space="preserve">5. Hafta</w:t>
             </w:r>
           </w:p>
           <w:p>
@@ -5632,7 +4850,7 @@
                 <w:sz w:val="17"/>
                 <w:szCs w:val="17"/>
               </w:rPr>
-              <w:t xml:space="preserve">1 Aralık 2026 · Salı</w:t>
+              <w:t xml:space="preserve">27 Ekim 2026 · Salı</w:t>
             </w:r>
           </w:p>
         </w:tc>
@@ -5662,7 +4880,7 @@
                 <w:sz w:val="18"/>
                 <w:szCs w:val="18"/>
               </w:rPr>
-              <w:t xml:space="preserve">2. ARA JÜRİ</w:t>
+              <w:t xml:space="preserve">ARAŞTIRMA SUNUMLARI</w:t>
             </w:r>
           </w:p>
         </w:tc>
@@ -5690,7 +4908,7 @@
                 <w:sz w:val="17"/>
                 <w:szCs w:val="17"/>
               </w:rPr>
-              <w:t xml:space="preserve">Tüm gün: jüri sunumları ve değerlendirme</w:t>
+              <w:t xml:space="preserve">Sunumlar ve kritikler</w:t>
             </w:r>
           </w:p>
         </w:tc>
@@ -5718,7 +4936,7 @@
                 <w:sz w:val="17"/>
                 <w:szCs w:val="17"/>
               </w:rPr>
-              <w:t xml:space="preserve">Teslim: 1/50 tam set (plan, en az iki kesit, cephe), tavan ve aydınlatma planı, malzeme paneli, yönlendirme şeması, en az üç iç mekân görseli</w:t>
+              <w:t xml:space="preserve">Teslim: marka anahtarı, kullanıcı profili, müşteri yolculuğu haritası, senaryo, anahtar kelimeler ve konsept panosu</w:t>
             </w:r>
           </w:p>
         </w:tc>
@@ -5727,6 +4945,7 @@
         <w:tc>
           <w:tcPr>
             <w:tcW w:type="dxa" w:w="1750"/>
+            <w:shd w:fill="F2F4F6" w:color="auto" w:val="clear"/>
             <w:tcMar>
               <w:top w:type="dxa" w:w="70"/>
               <w:left w:type="dxa" w:w="110"/>
@@ -5749,7 +4968,7 @@
                 <w:sz w:val="17"/>
                 <w:szCs w:val="17"/>
               </w:rPr>
-              <w:t xml:space="preserve">11. Hafta</w:t>
+              <w:t xml:space="preserve">6. Hafta</w:t>
             </w:r>
           </w:p>
           <w:p>
@@ -5766,13 +4985,14 @@
                 <w:sz w:val="17"/>
                 <w:szCs w:val="17"/>
               </w:rPr>
-              <w:t xml:space="preserve">8 Aralık 2026 · Salı</w:t>
+              <w:t xml:space="preserve">3 Kasım 2026 · Salı</w:t>
             </w:r>
           </w:p>
         </w:tc>
         <w:tc>
           <w:tcPr>
             <w:tcW w:type="dxa" w:w="2300"/>
+            <w:shd w:fill="F2F4F6" w:color="auto" w:val="clear"/>
             <w:tcMar>
               <w:top w:type="dxa" w:w="70"/>
               <w:left w:type="dxa" w:w="110"/>
@@ -5793,13 +5013,42 @@
                 <w:sz w:val="18"/>
                 <w:szCs w:val="18"/>
               </w:rPr>
-              <w:t xml:space="preserve">Atölye — Malzeme, ışık ve duyusal katman</w:t>
+              <w:t xml:space="preserve">Konsept Geliştirme / Mekânsal Yerleşim</w:t>
             </w:r>
           </w:p>
         </w:tc>
         <w:tc>
           <w:tcPr>
             <w:tcW w:type="dxa" w:w="2794"/>
+            <w:shd w:fill="F2F4F6" w:color="auto" w:val="clear"/>
+            <w:tcMar>
+              <w:top w:type="dxa" w:w="70"/>
+              <w:left w:type="dxa" w:w="110"/>
+              <w:bottom w:type="dxa" w:w="70"/>
+              <w:right w:type="dxa" w:w="110"/>
+            </w:tcMar>
+            <w:vAlign w:val="top"/>
+          </w:tcPr>
+          <w:p>
+            <w:pPr>
+              <w:spacing w:after="0" w:line="250"/>
+              <w:jc w:val="left"/>
+            </w:pPr>
+            <w:r>
+              <w:rPr>
+                <w:rFonts w:ascii="Calibri" w:cs="Calibri" w:eastAsia="Calibri" w:hAnsi="Calibri"/>
+                <w:color w:val="1A1A1A"/>
+                <w:sz w:val="17"/>
+                <w:szCs w:val="17"/>
+              </w:rPr>
+              <w:t xml:space="preserve">Kritikler</w:t>
+            </w:r>
+          </w:p>
+        </w:tc>
+        <w:tc>
+          <w:tcPr>
+            <w:tcW w:type="dxa" w:w="2794"/>
+            <w:shd w:fill="F2F4F6" w:color="auto" w:val="clear"/>
             <w:tcMar>
               <w:top w:type="dxa" w:w="70"/>
               <w:left w:type="dxa" w:w="110"/>
@@ -5820,36 +5069,9 @@
                 <w:sz w:val="17"/>
                 <w:szCs w:val="17"/>
               </w:rPr>
-              <w:t xml:space="preserve">Atölye: aydınlatmanın dört katmanı, malzeme seçimi, akustik ve koku</w:t>
-            </w:r>
-          </w:p>
-          <w:p>
-            <w:pPr>
-              <w:spacing w:after="0" w:line="250"/>
-              <w:jc w:val="left"/>
-            </w:pPr>
-            <w:r>
-              <w:rPr>
-                <w:rFonts w:ascii="Calibri" w:cs="Calibri" w:eastAsia="Calibri" w:hAnsi="Calibri"/>
-                <w:color w:val="1A1A1A"/>
-                <w:sz w:val="17"/>
-                <w:szCs w:val="17"/>
-              </w:rPr>
-              <w:t xml:space="preserve">Kritikler: jüri geri bildirimlerinin revizyonu</w:t>
-            </w:r>
-          </w:p>
-        </w:tc>
-        <w:tc>
-          <w:tcPr>
-            <w:tcW w:type="dxa" w:w="2794"/>
-            <w:tcMar>
-              <w:top w:type="dxa" w:w="70"/>
-              <w:left w:type="dxa" w:w="110"/>
-              <w:bottom w:type="dxa" w:w="70"/>
-              <w:right w:type="dxa" w:w="110"/>
-            </w:tcMar>
-            <w:vAlign w:val="top"/>
-          </w:tcPr>
+              <w:t xml:space="preserve">Program öğelerinin dağılımı</w:t>
+            </w:r>
+          </w:p>
           <w:p>
             <w:pPr>
               <w:spacing w:after="40" w:line="250"/>
@@ -5862,22 +5084,37 @@
                 <w:sz w:val="17"/>
                 <w:szCs w:val="17"/>
               </w:rPr>
-              <w:t xml:space="preserve">Revize 1/50 set</w:t>
-            </w:r>
-          </w:p>
-          <w:p>
-            <w:pPr>
-              <w:spacing w:after="0" w:line="250"/>
-              <w:jc w:val="left"/>
-            </w:pPr>
-            <w:r>
-              <w:rPr>
-                <w:rFonts w:ascii="Calibri" w:cs="Calibri" w:eastAsia="Calibri" w:hAnsi="Calibri"/>
-                <w:color w:val="1A1A1A"/>
-                <w:sz w:val="17"/>
-                <w:szCs w:val="17"/>
-              </w:rPr>
-              <w:t xml:space="preserve">1/20 kısmi plan ve kesit başlangıcı</w:t>
+              <w:t xml:space="preserve">1/100 zoning şeması</w:t>
+            </w:r>
+          </w:p>
+          <w:p>
+            <w:pPr>
+              <w:spacing w:after="40" w:line="250"/>
+              <w:jc w:val="left"/>
+            </w:pPr>
+            <w:r>
+              <w:rPr>
+                <w:rFonts w:ascii="Calibri" w:cs="Calibri" w:eastAsia="Calibri" w:hAnsi="Calibri"/>
+                <w:color w:val="1A1A1A"/>
+                <w:sz w:val="17"/>
+                <w:szCs w:val="17"/>
+              </w:rPr>
+              <w:t xml:space="preserve">1/50 plan ve kesitler</w:t>
+            </w:r>
+          </w:p>
+          <w:p>
+            <w:pPr>
+              <w:spacing w:after="0" w:line="250"/>
+              <w:jc w:val="left"/>
+            </w:pPr>
+            <w:r>
+              <w:rPr>
+                <w:rFonts w:ascii="Calibri" w:cs="Calibri" w:eastAsia="Calibri" w:hAnsi="Calibri"/>
+                <w:color w:val="1A1A1A"/>
+                <w:sz w:val="17"/>
+                <w:szCs w:val="17"/>
+              </w:rPr>
+              <w:t xml:space="preserve">Kavramsal 3B modeller</w:t>
             </w:r>
           </w:p>
         </w:tc>
@@ -5886,7 +5123,6 @@
         <w:tc>
           <w:tcPr>
             <w:tcW w:type="dxa" w:w="1750"/>
-            <w:shd w:fill="F2F4F6" w:color="auto" w:val="clear"/>
             <w:tcMar>
               <w:top w:type="dxa" w:w="70"/>
               <w:left w:type="dxa" w:w="110"/>
@@ -5909,7 +5145,7 @@
                 <w:sz w:val="17"/>
                 <w:szCs w:val="17"/>
               </w:rPr>
-              <w:t xml:space="preserve">12. Hafta</w:t>
+              <w:t xml:space="preserve">7. Hafta</w:t>
             </w:r>
           </w:p>
           <w:p>
@@ -5926,7 +5162,167 @@
                 <w:sz w:val="17"/>
                 <w:szCs w:val="17"/>
               </w:rPr>
-              <w:t xml:space="preserve">15 Aralık 2026 · Salı</w:t>
+              <w:t xml:space="preserve">10 Kasım 2026 · Salı</w:t>
+            </w:r>
+          </w:p>
+        </w:tc>
+        <w:tc>
+          <w:tcPr>
+            <w:tcW w:type="dxa" w:w="2300"/>
+            <w:tcMar>
+              <w:top w:type="dxa" w:w="70"/>
+              <w:left w:type="dxa" w:w="110"/>
+              <w:bottom w:type="dxa" w:w="70"/>
+              <w:right w:type="dxa" w:w="110"/>
+            </w:tcMar>
+            <w:vAlign w:val="top"/>
+          </w:tcPr>
+          <w:p>
+            <w:pPr>
+              <w:spacing w:after="0" w:line="250"/>
+              <w:jc w:val="left"/>
+            </w:pPr>
+            <w:r>
+              <w:rPr>
+                <w:rFonts w:ascii="Calibri" w:cs="Calibri" w:eastAsia="Calibri" w:hAnsi="Calibri"/>
+                <w:color w:val="1A1A1A"/>
+                <w:sz w:val="18"/>
+                <w:szCs w:val="18"/>
+              </w:rPr>
+              <w:t xml:space="preserve">Konsept Geliştirme / Mekânsal Yerleşim</w:t>
+            </w:r>
+          </w:p>
+        </w:tc>
+        <w:tc>
+          <w:tcPr>
+            <w:tcW w:type="dxa" w:w="2794"/>
+            <w:tcMar>
+              <w:top w:type="dxa" w:w="70"/>
+              <w:left w:type="dxa" w:w="110"/>
+              <w:bottom w:type="dxa" w:w="70"/>
+              <w:right w:type="dxa" w:w="110"/>
+            </w:tcMar>
+            <w:vAlign w:val="top"/>
+          </w:tcPr>
+          <w:p>
+            <w:pPr>
+              <w:spacing w:after="0" w:line="250"/>
+              <w:jc w:val="left"/>
+            </w:pPr>
+            <w:r>
+              <w:rPr>
+                <w:rFonts w:ascii="Calibri" w:cs="Calibri" w:eastAsia="Calibri" w:hAnsi="Calibri"/>
+                <w:color w:val="1A1A1A"/>
+                <w:sz w:val="17"/>
+                <w:szCs w:val="17"/>
+              </w:rPr>
+              <w:t xml:space="preserve">Kritikler</w:t>
+            </w:r>
+          </w:p>
+        </w:tc>
+        <w:tc>
+          <w:tcPr>
+            <w:tcW w:type="dxa" w:w="2794"/>
+            <w:tcMar>
+              <w:top w:type="dxa" w:w="70"/>
+              <w:left w:type="dxa" w:w="110"/>
+              <w:bottom w:type="dxa" w:w="70"/>
+              <w:right w:type="dxa" w:w="110"/>
+            </w:tcMar>
+            <w:vAlign w:val="top"/>
+          </w:tcPr>
+          <w:p>
+            <w:pPr>
+              <w:spacing w:after="40" w:line="250"/>
+              <w:jc w:val="left"/>
+            </w:pPr>
+            <w:r>
+              <w:rPr>
+                <w:rFonts w:ascii="Calibri" w:cs="Calibri" w:eastAsia="Calibri" w:hAnsi="Calibri"/>
+                <w:color w:val="1A1A1A"/>
+                <w:sz w:val="17"/>
+                <w:szCs w:val="17"/>
+              </w:rPr>
+              <w:t xml:space="preserve">Cephe, vitrin, giriş ve eşik</w:t>
+            </w:r>
+          </w:p>
+          <w:p>
+            <w:pPr>
+              <w:spacing w:after="40" w:line="250"/>
+              <w:jc w:val="left"/>
+            </w:pPr>
+            <w:r>
+              <w:rPr>
+                <w:rFonts w:ascii="Calibri" w:cs="Calibri" w:eastAsia="Calibri" w:hAnsi="Calibri"/>
+                <w:color w:val="1A1A1A"/>
+                <w:sz w:val="17"/>
+                <w:szCs w:val="17"/>
+              </w:rPr>
+              <w:t xml:space="preserve">1/50 plan, kesit ve cephe</w:t>
+            </w:r>
+          </w:p>
+          <w:p>
+            <w:pPr>
+              <w:spacing w:after="0" w:line="250"/>
+              <w:jc w:val="left"/>
+            </w:pPr>
+            <w:r>
+              <w:rPr>
+                <w:rFonts w:ascii="Calibri" w:cs="Calibri" w:eastAsia="Calibri" w:hAnsi="Calibri"/>
+                <w:color w:val="1A1A1A"/>
+                <w:sz w:val="17"/>
+                <w:szCs w:val="17"/>
+              </w:rPr>
+              <w:t xml:space="preserve">Kavramsal 3B modeller</w:t>
+            </w:r>
+          </w:p>
+        </w:tc>
+      </w:tr>
+      <w:tr>
+        <w:tc>
+          <w:tcPr>
+            <w:tcW w:type="dxa" w:w="1750"/>
+            <w:shd w:fill="F2F4F6" w:color="auto" w:val="clear"/>
+            <w:tcMar>
+              <w:top w:type="dxa" w:w="70"/>
+              <w:left w:type="dxa" w:w="110"/>
+              <w:bottom w:type="dxa" w:w="70"/>
+              <w:right w:type="dxa" w:w="110"/>
+            </w:tcMar>
+            <w:vAlign w:val="top"/>
+          </w:tcPr>
+          <w:p>
+            <w:pPr>
+              <w:spacing w:after="40" w:line="250"/>
+              <w:jc w:val="left"/>
+            </w:pPr>
+            <w:r>
+              <w:rPr>
+                <w:rFonts w:ascii="Calibri" w:cs="Calibri" w:eastAsia="Calibri" w:hAnsi="Calibri"/>
+                <w:b/>
+                <w:bCs/>
+                <w:color w:val="1A1A1A"/>
+                <w:sz w:val="17"/>
+                <w:szCs w:val="17"/>
+              </w:rPr>
+              <w:t xml:space="preserve">8. Hafta</w:t>
+            </w:r>
+          </w:p>
+          <w:p>
+            <w:pPr>
+              <w:spacing w:after="0" w:line="250"/>
+              <w:jc w:val="left"/>
+            </w:pPr>
+            <w:r>
+              <w:rPr>
+                <w:rFonts w:ascii="Calibri" w:cs="Calibri" w:eastAsia="Calibri" w:hAnsi="Calibri"/>
+                <w:b w:val="false"/>
+                <w:bCs w:val="false"/>
+                <w:color w:val="1A1A1A"/>
+                <w:sz w:val="17"/>
+                <w:szCs w:val="17"/>
+              </w:rPr>
+              <w:t xml:space="preserve">17 Kasım 2026 · Salı</w:t>
             </w:r>
           </w:p>
         </w:tc>
@@ -5954,7 +5350,7 @@
                 <w:sz w:val="18"/>
                 <w:szCs w:val="18"/>
               </w:rPr>
-              <w:t xml:space="preserve">Detay tasarımı</w:t>
+              <w:t xml:space="preserve">Tasarım Geliştirme</w:t>
             </w:r>
           </w:p>
         </w:tc>
@@ -5972,32 +5368,17 @@
           </w:tcPr>
           <w:p>
             <w:pPr>
-              <w:spacing w:after="40" w:line="250"/>
-              <w:jc w:val="left"/>
-            </w:pPr>
-            <w:r>
-              <w:rPr>
-                <w:rFonts w:ascii="Calibri" w:cs="Calibri" w:eastAsia="Calibri" w:hAnsi="Calibri"/>
-                <w:color w:val="1A1A1A"/>
-                <w:sz w:val="17"/>
-                <w:szCs w:val="17"/>
-              </w:rPr>
-              <w:t xml:space="preserve">Kritikler: 1/20 kısmi plan ve kesit</w:t>
-            </w:r>
-          </w:p>
-          <w:p>
-            <w:pPr>
-              <w:spacing w:after="0" w:line="250"/>
-              <w:jc w:val="left"/>
-            </w:pPr>
-            <w:r>
-              <w:rPr>
-                <w:rFonts w:ascii="Calibri" w:cs="Calibri" w:eastAsia="Calibri" w:hAnsi="Calibri"/>
-                <w:color w:val="1A1A1A"/>
-                <w:sz w:val="17"/>
-                <w:szCs w:val="17"/>
-              </w:rPr>
-              <w:t xml:space="preserve">Kritikler: mobilya ve teşhir birimi, birleşim detayı</w:t>
+              <w:spacing w:after="0" w:line="250"/>
+              <w:jc w:val="left"/>
+            </w:pPr>
+            <w:r>
+              <w:rPr>
+                <w:rFonts w:ascii="Calibri" w:cs="Calibri" w:eastAsia="Calibri" w:hAnsi="Calibri"/>
+                <w:color w:val="1A1A1A"/>
+                <w:sz w:val="17"/>
+                <w:szCs w:val="17"/>
+              </w:rPr>
+              <w:t xml:space="preserve">Kritikler</w:t>
             </w:r>
           </w:p>
         </w:tc>
@@ -6025,22 +5406,37 @@
                 <w:sz w:val="17"/>
                 <w:szCs w:val="17"/>
               </w:rPr>
-              <w:t xml:space="preserve">1/20 kısmi plan ve kesit</w:t>
-            </w:r>
-          </w:p>
-          <w:p>
-            <w:pPr>
-              <w:spacing w:after="0" w:line="250"/>
-              <w:jc w:val="left"/>
-            </w:pPr>
-            <w:r>
-              <w:rPr>
-                <w:rFonts w:ascii="Calibri" w:cs="Calibri" w:eastAsia="Calibri" w:hAnsi="Calibri"/>
-                <w:color w:val="1A1A1A"/>
-                <w:sz w:val="17"/>
-                <w:szCs w:val="17"/>
-              </w:rPr>
-              <w:t xml:space="preserve">1/10–1/5 detay çalışması</w:t>
+              <w:t xml:space="preserve">Kasa, kasa arkası, depo ve personel alanı</w:t>
+            </w:r>
+          </w:p>
+          <w:p>
+            <w:pPr>
+              <w:spacing w:after="40" w:line="250"/>
+              <w:jc w:val="left"/>
+            </w:pPr>
+            <w:r>
+              <w:rPr>
+                <w:rFonts w:ascii="Calibri" w:cs="Calibri" w:eastAsia="Calibri" w:hAnsi="Calibri"/>
+                <w:color w:val="1A1A1A"/>
+                <w:sz w:val="17"/>
+                <w:szCs w:val="17"/>
+              </w:rPr>
+              <w:t xml:space="preserve">Servis rotası ve dolaşım</w:t>
+            </w:r>
+          </w:p>
+          <w:p>
+            <w:pPr>
+              <w:spacing w:after="0" w:line="250"/>
+              <w:jc w:val="left"/>
+            </w:pPr>
+            <w:r>
+              <w:rPr>
+                <w:rFonts w:ascii="Calibri" w:cs="Calibri" w:eastAsia="Calibri" w:hAnsi="Calibri"/>
+                <w:color w:val="1A1A1A"/>
+                <w:sz w:val="17"/>
+                <w:szCs w:val="17"/>
+              </w:rPr>
+              <w:t xml:space="preserve">1/50 plan ve kesitler</w:t>
             </w:r>
           </w:p>
         </w:tc>
@@ -6071,7 +5467,7 @@
                 <w:sz w:val="17"/>
                 <w:szCs w:val="17"/>
               </w:rPr>
-              <w:t xml:space="preserve">13. Hafta</w:t>
+              <w:t xml:space="preserve">9. Hafta</w:t>
             </w:r>
           </w:p>
           <w:p>
@@ -6088,7 +5484,7 @@
                 <w:sz w:val="17"/>
                 <w:szCs w:val="17"/>
               </w:rPr>
-              <w:t xml:space="preserve">22 Aralık 2026 · Salı</w:t>
+              <w:t xml:space="preserve">24 Kasım 2026 · Salı</w:t>
             </w:r>
           </w:p>
         </w:tc>
@@ -6115,7 +5511,7 @@
                 <w:sz w:val="18"/>
                 <w:szCs w:val="18"/>
               </w:rPr>
-              <w:t xml:space="preserve">Detay ve sunum kurgusu</w:t>
+              <w:t xml:space="preserve">Tasarım Geliştirme</w:t>
             </w:r>
           </w:p>
         </w:tc>
@@ -6132,6 +5528,33 @@
           </w:tcPr>
           <w:p>
             <w:pPr>
+              <w:spacing w:after="0" w:line="250"/>
+              <w:jc w:val="left"/>
+            </w:pPr>
+            <w:r>
+              <w:rPr>
+                <w:rFonts w:ascii="Calibri" w:cs="Calibri" w:eastAsia="Calibri" w:hAnsi="Calibri"/>
+                <w:color w:val="1A1A1A"/>
+                <w:sz w:val="17"/>
+                <w:szCs w:val="17"/>
+              </w:rPr>
+              <w:t xml:space="preserve">Kritikler</w:t>
+            </w:r>
+          </w:p>
+        </w:tc>
+        <w:tc>
+          <w:tcPr>
+            <w:tcW w:type="dxa" w:w="2794"/>
+            <w:tcMar>
+              <w:top w:type="dxa" w:w="70"/>
+              <w:left w:type="dxa" w:w="110"/>
+              <w:bottom w:type="dxa" w:w="70"/>
+              <w:right w:type="dxa" w:w="110"/>
+            </w:tcMar>
+            <w:vAlign w:val="top"/>
+          </w:tcPr>
+          <w:p>
+            <w:pPr>
               <w:spacing w:after="40" w:line="250"/>
               <w:jc w:val="left"/>
             </w:pPr>
@@ -6142,36 +5565,9 @@
                 <w:sz w:val="17"/>
                 <w:szCs w:val="17"/>
               </w:rPr>
-              <w:t xml:space="preserve">Kritikler: detayların tamamlanması, malzeme lejantı</w:t>
-            </w:r>
-          </w:p>
-          <w:p>
-            <w:pPr>
-              <w:spacing w:after="0" w:line="250"/>
-              <w:jc w:val="left"/>
-            </w:pPr>
-            <w:r>
-              <w:rPr>
-                <w:rFonts w:ascii="Calibri" w:cs="Calibri" w:eastAsia="Calibri" w:hAnsi="Calibri"/>
-                <w:color w:val="1A1A1A"/>
-                <w:sz w:val="17"/>
-                <w:szCs w:val="17"/>
-              </w:rPr>
-              <w:t xml:space="preserve">Kritikler: pafta kurgusu, çizim niteliği, görselleştirme, maket</w:t>
-            </w:r>
-          </w:p>
-        </w:tc>
-        <w:tc>
-          <w:tcPr>
-            <w:tcW w:type="dxa" w:w="2794"/>
-            <w:tcMar>
-              <w:top w:type="dxa" w:w="70"/>
-              <w:left w:type="dxa" w:w="110"/>
-              <w:bottom w:type="dxa" w:w="70"/>
-              <w:right w:type="dxa" w:w="110"/>
-            </w:tcMar>
-            <w:vAlign w:val="top"/>
-          </w:tcPr>
+              <w:t xml:space="preserve">1/50 plan, kesit ve cephe</w:t>
+            </w:r>
+          </w:p>
           <w:p>
             <w:pPr>
               <w:spacing w:after="40" w:line="250"/>
@@ -6184,39 +5580,9 @@
                 <w:sz w:val="17"/>
                 <w:szCs w:val="17"/>
               </w:rPr>
-              <w:t xml:space="preserve">Final paftalarının provası</w:t>
-            </w:r>
-          </w:p>
-          <w:p>
-            <w:pPr>
-              <w:spacing w:after="0" w:line="250"/>
-              <w:jc w:val="left"/>
-            </w:pPr>
-            <w:r>
-              <w:rPr>
-                <w:rFonts w:ascii="Calibri" w:cs="Calibri" w:eastAsia="Calibri" w:hAnsi="Calibri"/>
-                <w:color w:val="1A1A1A"/>
-                <w:sz w:val="17"/>
-                <w:szCs w:val="17"/>
-              </w:rPr>
-              <w:t xml:space="preserve">Fiziksel maket</w:t>
-            </w:r>
-          </w:p>
-        </w:tc>
-      </w:tr>
-      <w:tr>
-        <w:tc>
-          <w:tcPr>
-            <w:tcW w:type="dxa" w:w="1750"/>
-            <w:shd w:fill="F2F4F6" w:color="auto" w:val="clear"/>
-            <w:tcMar>
-              <w:top w:type="dxa" w:w="70"/>
-              <w:left w:type="dxa" w:w="110"/>
-              <w:bottom w:type="dxa" w:w="70"/>
-              <w:right w:type="dxa" w:w="110"/>
-            </w:tcMar>
-            <w:vAlign w:val="top"/>
-          </w:tcPr>
+              <w:t xml:space="preserve">1/50 tavan ve aydınlatma planı</w:t>
+            </w:r>
+          </w:p>
           <w:p>
             <w:pPr>
               <w:spacing w:after="40" w:line="250"/>
@@ -6225,129 +5591,26 @@
             <w:r>
               <w:rPr>
                 <w:rFonts w:ascii="Calibri" w:cs="Calibri" w:eastAsia="Calibri" w:hAnsi="Calibri"/>
-                <w:b/>
-                <w:bCs/>
-                <w:color w:val="1A1A1A"/>
-                <w:sz w:val="17"/>
-                <w:szCs w:val="17"/>
-              </w:rPr>
-              <w:t xml:space="preserve">14. Hafta</w:t>
-            </w:r>
-          </w:p>
-          <w:p>
-            <w:pPr>
-              <w:spacing w:after="0" w:line="250"/>
-              <w:jc w:val="left"/>
-            </w:pPr>
-            <w:r>
-              <w:rPr>
-                <w:rFonts w:ascii="Calibri" w:cs="Calibri" w:eastAsia="Calibri" w:hAnsi="Calibri"/>
-                <w:b w:val="false"/>
-                <w:bCs w:val="false"/>
-                <w:color w:val="1A1A1A"/>
-                <w:sz w:val="17"/>
-                <w:szCs w:val="17"/>
-              </w:rPr>
-              <w:t xml:space="preserve">29 Aralık 2026 · Salı</w:t>
-            </w:r>
-          </w:p>
-        </w:tc>
-        <w:tc>
-          <w:tcPr>
-            <w:tcW w:type="dxa" w:w="2300"/>
-            <w:shd w:fill="F2F4F6" w:color="auto" w:val="clear"/>
-            <w:tcMar>
-              <w:top w:type="dxa" w:w="70"/>
-              <w:left w:type="dxa" w:w="110"/>
-              <w:bottom w:type="dxa" w:w="70"/>
-              <w:right w:type="dxa" w:w="110"/>
-            </w:tcMar>
-            <w:vAlign w:val="top"/>
-          </w:tcPr>
-          <w:p>
-            <w:pPr>
-              <w:spacing w:after="0" w:line="250"/>
-              <w:jc w:val="left"/>
-            </w:pPr>
-            <w:r>
-              <w:rPr>
-                <w:rFonts w:ascii="Calibri" w:cs="Calibri" w:eastAsia="Calibri" w:hAnsi="Calibri"/>
-                <w:color w:val="1A1A1A"/>
-                <w:sz w:val="18"/>
-                <w:szCs w:val="18"/>
-              </w:rPr>
-              <w:t xml:space="preserve">Tamamlama ve final provası</w:t>
-            </w:r>
-          </w:p>
-        </w:tc>
-        <w:tc>
-          <w:tcPr>
-            <w:tcW w:type="dxa" w:w="2794"/>
-            <w:shd w:fill="F2F4F6" w:color="auto" w:val="clear"/>
-            <w:tcMar>
-              <w:top w:type="dxa" w:w="70"/>
-              <w:left w:type="dxa" w:w="110"/>
-              <w:bottom w:type="dxa" w:w="70"/>
-              <w:right w:type="dxa" w:w="110"/>
-            </w:tcMar>
-            <w:vAlign w:val="top"/>
-          </w:tcPr>
-          <w:p>
-            <w:pPr>
-              <w:spacing w:after="40" w:line="250"/>
-              <w:jc w:val="left"/>
-            </w:pPr>
-            <w:r>
-              <w:rPr>
-                <w:rFonts w:ascii="Calibri" w:cs="Calibri" w:eastAsia="Calibri" w:hAnsi="Calibri"/>
-                <w:color w:val="1A1A1A"/>
-                <w:sz w:val="17"/>
-                <w:szCs w:val="17"/>
-              </w:rPr>
-              <w:t xml:space="preserve">Kritikler: eksiklerin tamamlanması</w:t>
-            </w:r>
-          </w:p>
-          <w:p>
-            <w:pPr>
-              <w:spacing w:after="0" w:line="250"/>
-              <w:jc w:val="left"/>
-            </w:pPr>
-            <w:r>
-              <w:rPr>
-                <w:rFonts w:ascii="Calibri" w:cs="Calibri" w:eastAsia="Calibri" w:hAnsi="Calibri"/>
-                <w:color w:val="1A1A1A"/>
-                <w:sz w:val="17"/>
-                <w:szCs w:val="17"/>
-              </w:rPr>
-              <w:t xml:space="preserve">Sözlü sunum provası</w:t>
-            </w:r>
-          </w:p>
-        </w:tc>
-        <w:tc>
-          <w:tcPr>
-            <w:tcW w:type="dxa" w:w="2794"/>
-            <w:shd w:fill="F2F4F6" w:color="auto" w:val="clear"/>
-            <w:tcMar>
-              <w:top w:type="dxa" w:w="70"/>
-              <w:left w:type="dxa" w:w="110"/>
-              <w:bottom w:type="dxa" w:w="70"/>
-              <w:right w:type="dxa" w:w="110"/>
-            </w:tcMar>
-            <w:vAlign w:val="top"/>
-          </w:tcPr>
-          <w:p>
-            <w:pPr>
-              <w:spacing w:after="0" w:line="250"/>
-              <w:jc w:val="left"/>
-            </w:pPr>
-            <w:r>
-              <w:rPr>
-                <w:rFonts w:ascii="Calibri" w:cs="Calibri" w:eastAsia="Calibri" w:hAnsi="Calibri"/>
-                <w:color w:val="1A1A1A"/>
-                <w:sz w:val="17"/>
-                <w:szCs w:val="17"/>
-              </w:rPr>
-              <w:t xml:space="preserve">Final teslim paketinin tamamlanması</w:t>
+                <w:color w:val="1A1A1A"/>
+                <w:sz w:val="17"/>
+                <w:szCs w:val="17"/>
+              </w:rPr>
+              <w:t xml:space="preserve">Malzeme paneli</w:t>
+            </w:r>
+          </w:p>
+          <w:p>
+            <w:pPr>
+              <w:spacing w:after="0" w:line="250"/>
+              <w:jc w:val="left"/>
+            </w:pPr>
+            <w:r>
+              <w:rPr>
+                <w:rFonts w:ascii="Calibri" w:cs="Calibri" w:eastAsia="Calibri" w:hAnsi="Calibri"/>
+                <w:color w:val="1A1A1A"/>
+                <w:sz w:val="17"/>
+                <w:szCs w:val="17"/>
+              </w:rPr>
+              <w:t xml:space="preserve">3B görseller</w:t>
             </w:r>
           </w:p>
         </w:tc>
@@ -6379,7 +5642,7 @@
                 <w:sz w:val="17"/>
                 <w:szCs w:val="17"/>
               </w:rPr>
-              <w:t xml:space="preserve">FİNAL JÜRİSİ</w:t>
+              <w:t xml:space="preserve">10. Hafta</w:t>
             </w:r>
           </w:p>
           <w:p>
@@ -6396,7 +5659,7 @@
                 <w:sz w:val="17"/>
                 <w:szCs w:val="17"/>
               </w:rPr>
-              <w:t xml:space="preserve">Final sınav haftası</w:t>
+              <w:t xml:space="preserve">1 Aralık 2026 · Salı</w:t>
             </w:r>
           </w:p>
         </w:tc>
@@ -6426,6 +5689,815 @@
                 <w:sz w:val="18"/>
                 <w:szCs w:val="18"/>
               </w:rPr>
+              <w:t xml:space="preserve">ARA JÜRİ</w:t>
+            </w:r>
+          </w:p>
+        </w:tc>
+        <w:tc>
+          <w:tcPr>
+            <w:tcW w:type="dxa" w:w="2794"/>
+            <w:shd w:fill="F6EAE6" w:color="auto" w:val="clear"/>
+            <w:tcMar>
+              <w:top w:type="dxa" w:w="70"/>
+              <w:left w:type="dxa" w:w="110"/>
+              <w:bottom w:type="dxa" w:w="70"/>
+              <w:right w:type="dxa" w:w="110"/>
+            </w:tcMar>
+            <w:vAlign w:val="top"/>
+          </w:tcPr>
+          <w:p>
+            <w:pPr>
+              <w:spacing w:after="0" w:line="250"/>
+              <w:jc w:val="left"/>
+            </w:pPr>
+            <w:r>
+              <w:rPr>
+                <w:rFonts w:ascii="Calibri" w:cs="Calibri" w:eastAsia="Calibri" w:hAnsi="Calibri"/>
+                <w:color w:val="1A1A1A"/>
+                <w:sz w:val="17"/>
+                <w:szCs w:val="17"/>
+              </w:rPr>
+              <w:t xml:space="preserve">Jüri sunumları ve değerlendirme</w:t>
+            </w:r>
+          </w:p>
+        </w:tc>
+        <w:tc>
+          <w:tcPr>
+            <w:tcW w:type="dxa" w:w="2794"/>
+            <w:shd w:fill="F6EAE6" w:color="auto" w:val="clear"/>
+            <w:tcMar>
+              <w:top w:type="dxa" w:w="70"/>
+              <w:left w:type="dxa" w:w="110"/>
+              <w:bottom w:type="dxa" w:w="70"/>
+              <w:right w:type="dxa" w:w="110"/>
+            </w:tcMar>
+            <w:vAlign w:val="top"/>
+          </w:tcPr>
+          <w:p>
+            <w:pPr>
+              <w:spacing w:after="0" w:line="250"/>
+              <w:jc w:val="left"/>
+            </w:pPr>
+            <w:r>
+              <w:rPr>
+                <w:rFonts w:ascii="Calibri" w:cs="Calibri" w:eastAsia="Calibri" w:hAnsi="Calibri"/>
+                <w:color w:val="1A1A1A"/>
+                <w:sz w:val="17"/>
+                <w:szCs w:val="17"/>
+              </w:rPr>
+              <w:t xml:space="preserve">Teslim gereklilikleri ayrıca paylaşılacaktır</w:t>
+            </w:r>
+          </w:p>
+        </w:tc>
+      </w:tr>
+      <w:tr>
+        <w:tc>
+          <w:tcPr>
+            <w:tcW w:type="dxa" w:w="1750"/>
+            <w:tcMar>
+              <w:top w:type="dxa" w:w="70"/>
+              <w:left w:type="dxa" w:w="110"/>
+              <w:bottom w:type="dxa" w:w="70"/>
+              <w:right w:type="dxa" w:w="110"/>
+            </w:tcMar>
+            <w:vAlign w:val="top"/>
+          </w:tcPr>
+          <w:p>
+            <w:pPr>
+              <w:spacing w:after="40" w:line="250"/>
+              <w:jc w:val="left"/>
+            </w:pPr>
+            <w:r>
+              <w:rPr>
+                <w:rFonts w:ascii="Calibri" w:cs="Calibri" w:eastAsia="Calibri" w:hAnsi="Calibri"/>
+                <w:b/>
+                <w:bCs/>
+                <w:color w:val="1A1A1A"/>
+                <w:sz w:val="17"/>
+                <w:szCs w:val="17"/>
+              </w:rPr>
+              <w:t xml:space="preserve">11. Hafta</w:t>
+            </w:r>
+          </w:p>
+          <w:p>
+            <w:pPr>
+              <w:spacing w:after="0" w:line="250"/>
+              <w:jc w:val="left"/>
+            </w:pPr>
+            <w:r>
+              <w:rPr>
+                <w:rFonts w:ascii="Calibri" w:cs="Calibri" w:eastAsia="Calibri" w:hAnsi="Calibri"/>
+                <w:b w:val="false"/>
+                <w:bCs w:val="false"/>
+                <w:color w:val="1A1A1A"/>
+                <w:sz w:val="17"/>
+                <w:szCs w:val="17"/>
+              </w:rPr>
+              <w:t xml:space="preserve">8 Aralık 2026 · Salı</w:t>
+            </w:r>
+          </w:p>
+        </w:tc>
+        <w:tc>
+          <w:tcPr>
+            <w:tcW w:type="dxa" w:w="2300"/>
+            <w:tcMar>
+              <w:top w:type="dxa" w:w="70"/>
+              <w:left w:type="dxa" w:w="110"/>
+              <w:bottom w:type="dxa" w:w="70"/>
+              <w:right w:type="dxa" w:w="110"/>
+            </w:tcMar>
+            <w:vAlign w:val="top"/>
+          </w:tcPr>
+          <w:p>
+            <w:pPr>
+              <w:spacing w:after="0" w:line="250"/>
+              <w:jc w:val="left"/>
+            </w:pPr>
+            <w:r>
+              <w:rPr>
+                <w:rFonts w:ascii="Calibri" w:cs="Calibri" w:eastAsia="Calibri" w:hAnsi="Calibri"/>
+                <w:color w:val="1A1A1A"/>
+                <w:sz w:val="18"/>
+                <w:szCs w:val="18"/>
+              </w:rPr>
+              <w:t xml:space="preserve">Tasarım Geliştirme</w:t>
+            </w:r>
+          </w:p>
+        </w:tc>
+        <w:tc>
+          <w:tcPr>
+            <w:tcW w:type="dxa" w:w="2794"/>
+            <w:tcMar>
+              <w:top w:type="dxa" w:w="70"/>
+              <w:left w:type="dxa" w:w="110"/>
+              <w:bottom w:type="dxa" w:w="70"/>
+              <w:right w:type="dxa" w:w="110"/>
+            </w:tcMar>
+            <w:vAlign w:val="top"/>
+          </w:tcPr>
+          <w:p>
+            <w:pPr>
+              <w:spacing w:after="0" w:line="250"/>
+              <w:jc w:val="left"/>
+            </w:pPr>
+            <w:r>
+              <w:rPr>
+                <w:rFonts w:ascii="Calibri" w:cs="Calibri" w:eastAsia="Calibri" w:hAnsi="Calibri"/>
+                <w:color w:val="1A1A1A"/>
+                <w:sz w:val="17"/>
+                <w:szCs w:val="17"/>
+              </w:rPr>
+              <w:t xml:space="preserve">Kritikler</w:t>
+            </w:r>
+          </w:p>
+        </w:tc>
+        <w:tc>
+          <w:tcPr>
+            <w:tcW w:type="dxa" w:w="2794"/>
+            <w:tcMar>
+              <w:top w:type="dxa" w:w="70"/>
+              <w:left w:type="dxa" w:w="110"/>
+              <w:bottom w:type="dxa" w:w="70"/>
+              <w:right w:type="dxa" w:w="110"/>
+            </w:tcMar>
+            <w:vAlign w:val="top"/>
+          </w:tcPr>
+          <w:p>
+            <w:pPr>
+              <w:spacing w:after="40" w:line="250"/>
+              <w:jc w:val="left"/>
+            </w:pPr>
+            <w:r>
+              <w:rPr>
+                <w:rFonts w:ascii="Calibri" w:cs="Calibri" w:eastAsia="Calibri" w:hAnsi="Calibri"/>
+                <w:color w:val="1A1A1A"/>
+                <w:sz w:val="17"/>
+                <w:szCs w:val="17"/>
+              </w:rPr>
+              <w:t xml:space="preserve">Revize 1/50 set</w:t>
+            </w:r>
+          </w:p>
+          <w:p>
+            <w:pPr>
+              <w:spacing w:after="40" w:line="250"/>
+              <w:jc w:val="left"/>
+            </w:pPr>
+            <w:r>
+              <w:rPr>
+                <w:rFonts w:ascii="Calibri" w:cs="Calibri" w:eastAsia="Calibri" w:hAnsi="Calibri"/>
+                <w:color w:val="1A1A1A"/>
+                <w:sz w:val="17"/>
+                <w:szCs w:val="17"/>
+              </w:rPr>
+              <w:t xml:space="preserve">1/20 kısmi plan ve kesit</w:t>
+            </w:r>
+          </w:p>
+          <w:p>
+            <w:pPr>
+              <w:spacing w:after="0" w:line="250"/>
+              <w:jc w:val="left"/>
+            </w:pPr>
+            <w:r>
+              <w:rPr>
+                <w:rFonts w:ascii="Calibri" w:cs="Calibri" w:eastAsia="Calibri" w:hAnsi="Calibri"/>
+                <w:color w:val="1A1A1A"/>
+                <w:sz w:val="17"/>
+                <w:szCs w:val="17"/>
+              </w:rPr>
+              <w:t xml:space="preserve">Malzeme, doku, renk ve aydınlatma kararları</w:t>
+            </w:r>
+          </w:p>
+        </w:tc>
+      </w:tr>
+      <w:tr>
+        <w:tc>
+          <w:tcPr>
+            <w:tcW w:type="dxa" w:w="1750"/>
+            <w:shd w:fill="F2F4F6" w:color="auto" w:val="clear"/>
+            <w:tcMar>
+              <w:top w:type="dxa" w:w="70"/>
+              <w:left w:type="dxa" w:w="110"/>
+              <w:bottom w:type="dxa" w:w="70"/>
+              <w:right w:type="dxa" w:w="110"/>
+            </w:tcMar>
+            <w:vAlign w:val="top"/>
+          </w:tcPr>
+          <w:p>
+            <w:pPr>
+              <w:spacing w:after="40" w:line="250"/>
+              <w:jc w:val="left"/>
+            </w:pPr>
+            <w:r>
+              <w:rPr>
+                <w:rFonts w:ascii="Calibri" w:cs="Calibri" w:eastAsia="Calibri" w:hAnsi="Calibri"/>
+                <w:b/>
+                <w:bCs/>
+                <w:color w:val="1A1A1A"/>
+                <w:sz w:val="17"/>
+                <w:szCs w:val="17"/>
+              </w:rPr>
+              <w:t xml:space="preserve">12. Hafta</w:t>
+            </w:r>
+          </w:p>
+          <w:p>
+            <w:pPr>
+              <w:spacing w:after="0" w:line="250"/>
+              <w:jc w:val="left"/>
+            </w:pPr>
+            <w:r>
+              <w:rPr>
+                <w:rFonts w:ascii="Calibri" w:cs="Calibri" w:eastAsia="Calibri" w:hAnsi="Calibri"/>
+                <w:b w:val="false"/>
+                <w:bCs w:val="false"/>
+                <w:color w:val="1A1A1A"/>
+                <w:sz w:val="17"/>
+                <w:szCs w:val="17"/>
+              </w:rPr>
+              <w:t xml:space="preserve">15 Aralık 2026 · Salı</w:t>
+            </w:r>
+          </w:p>
+        </w:tc>
+        <w:tc>
+          <w:tcPr>
+            <w:tcW w:type="dxa" w:w="2300"/>
+            <w:shd w:fill="F2F4F6" w:color="auto" w:val="clear"/>
+            <w:tcMar>
+              <w:top w:type="dxa" w:w="70"/>
+              <w:left w:type="dxa" w:w="110"/>
+              <w:bottom w:type="dxa" w:w="70"/>
+              <w:right w:type="dxa" w:w="110"/>
+            </w:tcMar>
+            <w:vAlign w:val="top"/>
+          </w:tcPr>
+          <w:p>
+            <w:pPr>
+              <w:spacing w:after="0" w:line="250"/>
+              <w:jc w:val="left"/>
+            </w:pPr>
+            <w:r>
+              <w:rPr>
+                <w:rFonts w:ascii="Calibri" w:cs="Calibri" w:eastAsia="Calibri" w:hAnsi="Calibri"/>
+                <w:color w:val="1A1A1A"/>
+                <w:sz w:val="18"/>
+                <w:szCs w:val="18"/>
+              </w:rPr>
+              <w:t xml:space="preserve">Detay Tasarımı</w:t>
+            </w:r>
+          </w:p>
+        </w:tc>
+        <w:tc>
+          <w:tcPr>
+            <w:tcW w:type="dxa" w:w="2794"/>
+            <w:shd w:fill="F2F4F6" w:color="auto" w:val="clear"/>
+            <w:tcMar>
+              <w:top w:type="dxa" w:w="70"/>
+              <w:left w:type="dxa" w:w="110"/>
+              <w:bottom w:type="dxa" w:w="70"/>
+              <w:right w:type="dxa" w:w="110"/>
+            </w:tcMar>
+            <w:vAlign w:val="top"/>
+          </w:tcPr>
+          <w:p>
+            <w:pPr>
+              <w:spacing w:after="0" w:line="250"/>
+              <w:jc w:val="left"/>
+            </w:pPr>
+            <w:r>
+              <w:rPr>
+                <w:rFonts w:ascii="Calibri" w:cs="Calibri" w:eastAsia="Calibri" w:hAnsi="Calibri"/>
+                <w:color w:val="1A1A1A"/>
+                <w:sz w:val="17"/>
+                <w:szCs w:val="17"/>
+              </w:rPr>
+              <w:t xml:space="preserve">Bireysel kritikler</w:t>
+            </w:r>
+          </w:p>
+        </w:tc>
+        <w:tc>
+          <w:tcPr>
+            <w:tcW w:type="dxa" w:w="2794"/>
+            <w:shd w:fill="F2F4F6" w:color="auto" w:val="clear"/>
+            <w:tcMar>
+              <w:top w:type="dxa" w:w="70"/>
+              <w:left w:type="dxa" w:w="110"/>
+              <w:bottom w:type="dxa" w:w="70"/>
+              <w:right w:type="dxa" w:w="110"/>
+            </w:tcMar>
+            <w:vAlign w:val="top"/>
+          </w:tcPr>
+          <w:p>
+            <w:pPr>
+              <w:spacing w:after="40" w:line="250"/>
+              <w:jc w:val="left"/>
+            </w:pPr>
+            <w:r>
+              <w:rPr>
+                <w:rFonts w:ascii="Calibri" w:cs="Calibri" w:eastAsia="Calibri" w:hAnsi="Calibri"/>
+                <w:color w:val="1A1A1A"/>
+                <w:sz w:val="17"/>
+                <w:szCs w:val="17"/>
+              </w:rPr>
+              <w:t xml:space="preserve">1/20 kısmi plan ve kesit</w:t>
+            </w:r>
+          </w:p>
+          <w:p>
+            <w:pPr>
+              <w:spacing w:after="40" w:line="250"/>
+              <w:jc w:val="left"/>
+            </w:pPr>
+            <w:r>
+              <w:rPr>
+                <w:rFonts w:ascii="Calibri" w:cs="Calibri" w:eastAsia="Calibri" w:hAnsi="Calibri"/>
+                <w:color w:val="1A1A1A"/>
+                <w:sz w:val="17"/>
+                <w:szCs w:val="17"/>
+              </w:rPr>
+              <w:t xml:space="preserve">Mobilya ve teşhir birimi</w:t>
+            </w:r>
+          </w:p>
+          <w:p>
+            <w:pPr>
+              <w:spacing w:after="40" w:line="250"/>
+              <w:jc w:val="left"/>
+            </w:pPr>
+            <w:r>
+              <w:rPr>
+                <w:rFonts w:ascii="Calibri" w:cs="Calibri" w:eastAsia="Calibri" w:hAnsi="Calibri"/>
+                <w:color w:val="1A1A1A"/>
+                <w:sz w:val="17"/>
+                <w:szCs w:val="17"/>
+              </w:rPr>
+              <w:t xml:space="preserve">1/10–1/5 detaylar</w:t>
+            </w:r>
+          </w:p>
+          <w:p>
+            <w:pPr>
+              <w:spacing w:after="0" w:line="250"/>
+              <w:jc w:val="left"/>
+            </w:pPr>
+            <w:r>
+              <w:rPr>
+                <w:rFonts w:ascii="Calibri" w:cs="Calibri" w:eastAsia="Calibri" w:hAnsi="Calibri"/>
+                <w:color w:val="1A1A1A"/>
+                <w:sz w:val="17"/>
+                <w:szCs w:val="17"/>
+              </w:rPr>
+              <w:t xml:space="preserve">Malzeme ve birleşim</w:t>
+            </w:r>
+          </w:p>
+        </w:tc>
+      </w:tr>
+      <w:tr>
+        <w:tc>
+          <w:tcPr>
+            <w:tcW w:type="dxa" w:w="1750"/>
+            <w:tcMar>
+              <w:top w:type="dxa" w:w="70"/>
+              <w:left w:type="dxa" w:w="110"/>
+              <w:bottom w:type="dxa" w:w="70"/>
+              <w:right w:type="dxa" w:w="110"/>
+            </w:tcMar>
+            <w:vAlign w:val="top"/>
+          </w:tcPr>
+          <w:p>
+            <w:pPr>
+              <w:spacing w:after="40" w:line="250"/>
+              <w:jc w:val="left"/>
+            </w:pPr>
+            <w:r>
+              <w:rPr>
+                <w:rFonts w:ascii="Calibri" w:cs="Calibri" w:eastAsia="Calibri" w:hAnsi="Calibri"/>
+                <w:b/>
+                <w:bCs/>
+                <w:color w:val="1A1A1A"/>
+                <w:sz w:val="17"/>
+                <w:szCs w:val="17"/>
+              </w:rPr>
+              <w:t xml:space="preserve">13. Hafta</w:t>
+            </w:r>
+          </w:p>
+          <w:p>
+            <w:pPr>
+              <w:spacing w:after="0" w:line="250"/>
+              <w:jc w:val="left"/>
+            </w:pPr>
+            <w:r>
+              <w:rPr>
+                <w:rFonts w:ascii="Calibri" w:cs="Calibri" w:eastAsia="Calibri" w:hAnsi="Calibri"/>
+                <w:b w:val="false"/>
+                <w:bCs w:val="false"/>
+                <w:color w:val="1A1A1A"/>
+                <w:sz w:val="17"/>
+                <w:szCs w:val="17"/>
+              </w:rPr>
+              <w:t xml:space="preserve">22 Aralık 2026 · Salı</w:t>
+            </w:r>
+          </w:p>
+        </w:tc>
+        <w:tc>
+          <w:tcPr>
+            <w:tcW w:type="dxa" w:w="2300"/>
+            <w:tcMar>
+              <w:top w:type="dxa" w:w="70"/>
+              <w:left w:type="dxa" w:w="110"/>
+              <w:bottom w:type="dxa" w:w="70"/>
+              <w:right w:type="dxa" w:w="110"/>
+            </w:tcMar>
+            <w:vAlign w:val="top"/>
+          </w:tcPr>
+          <w:p>
+            <w:pPr>
+              <w:spacing w:after="0" w:line="250"/>
+              <w:jc w:val="left"/>
+            </w:pPr>
+            <w:r>
+              <w:rPr>
+                <w:rFonts w:ascii="Calibri" w:cs="Calibri" w:eastAsia="Calibri" w:hAnsi="Calibri"/>
+                <w:color w:val="1A1A1A"/>
+                <w:sz w:val="18"/>
+                <w:szCs w:val="18"/>
+              </w:rPr>
+              <w:t xml:space="preserve">Detay Tasarımı</w:t>
+            </w:r>
+          </w:p>
+        </w:tc>
+        <w:tc>
+          <w:tcPr>
+            <w:tcW w:type="dxa" w:w="2794"/>
+            <w:tcMar>
+              <w:top w:type="dxa" w:w="70"/>
+              <w:left w:type="dxa" w:w="110"/>
+              <w:bottom w:type="dxa" w:w="70"/>
+              <w:right w:type="dxa" w:w="110"/>
+            </w:tcMar>
+            <w:vAlign w:val="top"/>
+          </w:tcPr>
+          <w:p>
+            <w:pPr>
+              <w:spacing w:after="0" w:line="250"/>
+              <w:jc w:val="left"/>
+            </w:pPr>
+            <w:r>
+              <w:rPr>
+                <w:rFonts w:ascii="Calibri" w:cs="Calibri" w:eastAsia="Calibri" w:hAnsi="Calibri"/>
+                <w:color w:val="1A1A1A"/>
+                <w:sz w:val="17"/>
+                <w:szCs w:val="17"/>
+              </w:rPr>
+              <w:t xml:space="preserve">Bireysel kritikler</w:t>
+            </w:r>
+          </w:p>
+        </w:tc>
+        <w:tc>
+          <w:tcPr>
+            <w:tcW w:type="dxa" w:w="2794"/>
+            <w:tcMar>
+              <w:top w:type="dxa" w:w="70"/>
+              <w:left w:type="dxa" w:w="110"/>
+              <w:bottom w:type="dxa" w:w="70"/>
+              <w:right w:type="dxa" w:w="110"/>
+            </w:tcMar>
+            <w:vAlign w:val="top"/>
+          </w:tcPr>
+          <w:p>
+            <w:pPr>
+              <w:spacing w:after="40" w:line="250"/>
+              <w:jc w:val="left"/>
+            </w:pPr>
+            <w:r>
+              <w:rPr>
+                <w:rFonts w:ascii="Calibri" w:cs="Calibri" w:eastAsia="Calibri" w:hAnsi="Calibri"/>
+                <w:color w:val="1A1A1A"/>
+                <w:sz w:val="17"/>
+                <w:szCs w:val="17"/>
+              </w:rPr>
+              <w:t xml:space="preserve">1/20 plan ve kesitler</w:t>
+            </w:r>
+          </w:p>
+          <w:p>
+            <w:pPr>
+              <w:spacing w:after="40" w:line="250"/>
+              <w:jc w:val="left"/>
+            </w:pPr>
+            <w:r>
+              <w:rPr>
+                <w:rFonts w:ascii="Calibri" w:cs="Calibri" w:eastAsia="Calibri" w:hAnsi="Calibri"/>
+                <w:color w:val="1A1A1A"/>
+                <w:sz w:val="17"/>
+                <w:szCs w:val="17"/>
+              </w:rPr>
+              <w:t xml:space="preserve">1/10–1/5 detaylar</w:t>
+            </w:r>
+          </w:p>
+          <w:p>
+            <w:pPr>
+              <w:spacing w:after="40" w:line="250"/>
+              <w:jc w:val="left"/>
+            </w:pPr>
+            <w:r>
+              <w:rPr>
+                <w:rFonts w:ascii="Calibri" w:cs="Calibri" w:eastAsia="Calibri" w:hAnsi="Calibri"/>
+                <w:color w:val="1A1A1A"/>
+                <w:sz w:val="17"/>
+                <w:szCs w:val="17"/>
+              </w:rPr>
+              <w:t xml:space="preserve">3B görseller</w:t>
+            </w:r>
+          </w:p>
+          <w:p>
+            <w:pPr>
+              <w:spacing w:after="0" w:line="250"/>
+              <w:jc w:val="left"/>
+            </w:pPr>
+            <w:r>
+              <w:rPr>
+                <w:rFonts w:ascii="Calibri" w:cs="Calibri" w:eastAsia="Calibri" w:hAnsi="Calibri"/>
+                <w:color w:val="1A1A1A"/>
+                <w:sz w:val="17"/>
+                <w:szCs w:val="17"/>
+              </w:rPr>
+              <w:t xml:space="preserve">Malzeme, aydınlatma ve renk</w:t>
+            </w:r>
+          </w:p>
+        </w:tc>
+      </w:tr>
+      <w:tr>
+        <w:tc>
+          <w:tcPr>
+            <w:tcW w:type="dxa" w:w="1750"/>
+            <w:shd w:fill="F2F4F6" w:color="auto" w:val="clear"/>
+            <w:tcMar>
+              <w:top w:type="dxa" w:w="70"/>
+              <w:left w:type="dxa" w:w="110"/>
+              <w:bottom w:type="dxa" w:w="70"/>
+              <w:right w:type="dxa" w:w="110"/>
+            </w:tcMar>
+            <w:vAlign w:val="top"/>
+          </w:tcPr>
+          <w:p>
+            <w:pPr>
+              <w:spacing w:after="40" w:line="250"/>
+              <w:jc w:val="left"/>
+            </w:pPr>
+            <w:r>
+              <w:rPr>
+                <w:rFonts w:ascii="Calibri" w:cs="Calibri" w:eastAsia="Calibri" w:hAnsi="Calibri"/>
+                <w:b/>
+                <w:bCs/>
+                <w:color w:val="1A1A1A"/>
+                <w:sz w:val="17"/>
+                <w:szCs w:val="17"/>
+              </w:rPr>
+              <w:t xml:space="preserve">14. Hafta</w:t>
+            </w:r>
+          </w:p>
+          <w:p>
+            <w:pPr>
+              <w:spacing w:after="0" w:line="250"/>
+              <w:jc w:val="left"/>
+            </w:pPr>
+            <w:r>
+              <w:rPr>
+                <w:rFonts w:ascii="Calibri" w:cs="Calibri" w:eastAsia="Calibri" w:hAnsi="Calibri"/>
+                <w:b w:val="false"/>
+                <w:bCs w:val="false"/>
+                <w:color w:val="1A1A1A"/>
+                <w:sz w:val="17"/>
+                <w:szCs w:val="17"/>
+              </w:rPr>
+              <w:t xml:space="preserve">29 Aralık 2026 · Salı</w:t>
+            </w:r>
+          </w:p>
+        </w:tc>
+        <w:tc>
+          <w:tcPr>
+            <w:tcW w:type="dxa" w:w="2300"/>
+            <w:shd w:fill="F2F4F6" w:color="auto" w:val="clear"/>
+            <w:tcMar>
+              <w:top w:type="dxa" w:w="70"/>
+              <w:left w:type="dxa" w:w="110"/>
+              <w:bottom w:type="dxa" w:w="70"/>
+              <w:right w:type="dxa" w:w="110"/>
+            </w:tcMar>
+            <w:vAlign w:val="top"/>
+          </w:tcPr>
+          <w:p>
+            <w:pPr>
+              <w:spacing w:after="0" w:line="250"/>
+              <w:jc w:val="left"/>
+            </w:pPr>
+            <w:r>
+              <w:rPr>
+                <w:rFonts w:ascii="Calibri" w:cs="Calibri" w:eastAsia="Calibri" w:hAnsi="Calibri"/>
+                <w:color w:val="1A1A1A"/>
+                <w:sz w:val="18"/>
+                <w:szCs w:val="18"/>
+              </w:rPr>
+              <w:t xml:space="preserve">Sunum Detayları ve Tamlık</w:t>
+            </w:r>
+          </w:p>
+        </w:tc>
+        <w:tc>
+          <w:tcPr>
+            <w:tcW w:type="dxa" w:w="2794"/>
+            <w:shd w:fill="F2F4F6" w:color="auto" w:val="clear"/>
+            <w:tcMar>
+              <w:top w:type="dxa" w:w="70"/>
+              <w:left w:type="dxa" w:w="110"/>
+              <w:bottom w:type="dxa" w:w="70"/>
+              <w:right w:type="dxa" w:w="110"/>
+            </w:tcMar>
+            <w:vAlign w:val="top"/>
+          </w:tcPr>
+          <w:p>
+            <w:pPr>
+              <w:spacing w:after="0" w:line="250"/>
+              <w:jc w:val="left"/>
+            </w:pPr>
+            <w:r>
+              <w:rPr>
+                <w:rFonts w:ascii="Calibri" w:cs="Calibri" w:eastAsia="Calibri" w:hAnsi="Calibri"/>
+                <w:color w:val="1A1A1A"/>
+                <w:sz w:val="17"/>
+                <w:szCs w:val="17"/>
+              </w:rPr>
+              <w:t xml:space="preserve">Bireysel kritikler</w:t>
+            </w:r>
+          </w:p>
+        </w:tc>
+        <w:tc>
+          <w:tcPr>
+            <w:tcW w:type="dxa" w:w="2794"/>
+            <w:shd w:fill="F2F4F6" w:color="auto" w:val="clear"/>
+            <w:tcMar>
+              <w:top w:type="dxa" w:w="70"/>
+              <w:left w:type="dxa" w:w="110"/>
+              <w:bottom w:type="dxa" w:w="70"/>
+              <w:right w:type="dxa" w:w="110"/>
+            </w:tcMar>
+            <w:vAlign w:val="top"/>
+          </w:tcPr>
+          <w:p>
+            <w:pPr>
+              <w:spacing w:after="40" w:line="250"/>
+              <w:jc w:val="left"/>
+            </w:pPr>
+            <w:r>
+              <w:rPr>
+                <w:rFonts w:ascii="Calibri" w:cs="Calibri" w:eastAsia="Calibri" w:hAnsi="Calibri"/>
+                <w:color w:val="1A1A1A"/>
+                <w:sz w:val="17"/>
+                <w:szCs w:val="17"/>
+              </w:rPr>
+              <w:t xml:space="preserve">Final teslim paketinin tamamlanması</w:t>
+            </w:r>
+          </w:p>
+          <w:p>
+            <w:pPr>
+              <w:spacing w:after="40" w:line="250"/>
+              <w:jc w:val="left"/>
+            </w:pPr>
+            <w:r>
+              <w:rPr>
+                <w:rFonts w:ascii="Calibri" w:cs="Calibri" w:eastAsia="Calibri" w:hAnsi="Calibri"/>
+                <w:color w:val="1A1A1A"/>
+                <w:sz w:val="17"/>
+                <w:szCs w:val="17"/>
+              </w:rPr>
+              <w:t xml:space="preserve">Pafta kurgusu ve maket</w:t>
+            </w:r>
+          </w:p>
+          <w:p>
+            <w:pPr>
+              <w:spacing w:after="0" w:line="250"/>
+              <w:jc w:val="left"/>
+            </w:pPr>
+            <w:r>
+              <w:rPr>
+                <w:rFonts w:ascii="Calibri" w:cs="Calibri" w:eastAsia="Calibri" w:hAnsi="Calibri"/>
+                <w:color w:val="1A1A1A"/>
+                <w:sz w:val="17"/>
+                <w:szCs w:val="17"/>
+              </w:rPr>
+              <w:t xml:space="preserve">Sözlü sunum provası</w:t>
+            </w:r>
+          </w:p>
+        </w:tc>
+      </w:tr>
+      <w:tr>
+        <w:tc>
+          <w:tcPr>
+            <w:tcW w:type="dxa" w:w="1750"/>
+            <w:shd w:fill="F6EAE6" w:color="auto" w:val="clear"/>
+            <w:tcMar>
+              <w:top w:type="dxa" w:w="70"/>
+              <w:left w:type="dxa" w:w="110"/>
+              <w:bottom w:type="dxa" w:w="70"/>
+              <w:right w:type="dxa" w:w="110"/>
+            </w:tcMar>
+            <w:vAlign w:val="top"/>
+          </w:tcPr>
+          <w:p>
+            <w:pPr>
+              <w:spacing w:after="40" w:line="250"/>
+              <w:jc w:val="left"/>
+            </w:pPr>
+            <w:r>
+              <w:rPr>
+                <w:rFonts w:ascii="Calibri" w:cs="Calibri" w:eastAsia="Calibri" w:hAnsi="Calibri"/>
+                <w:b/>
+                <w:bCs/>
+                <w:color w:val="8C3A2B"/>
+                <w:sz w:val="17"/>
+                <w:szCs w:val="17"/>
+              </w:rPr>
+              <w:t xml:space="preserve">FİNAL JÜRİSİ</w:t>
+            </w:r>
+          </w:p>
+          <w:p>
+            <w:pPr>
+              <w:spacing w:after="0" w:line="250"/>
+              <w:jc w:val="left"/>
+            </w:pPr>
+            <w:r>
+              <w:rPr>
+                <w:rFonts w:ascii="Calibri" w:cs="Calibri" w:eastAsia="Calibri" w:hAnsi="Calibri"/>
+                <w:b w:val="false"/>
+                <w:bCs w:val="false"/>
+                <w:color w:val="8C3A2B"/>
+                <w:sz w:val="17"/>
+                <w:szCs w:val="17"/>
+              </w:rPr>
+              <w:t xml:space="preserve">Final sınav haftası</w:t>
+            </w:r>
+          </w:p>
+        </w:tc>
+        <w:tc>
+          <w:tcPr>
+            <w:tcW w:type="dxa" w:w="2300"/>
+            <w:shd w:fill="F6EAE6" w:color="auto" w:val="clear"/>
+            <w:tcMar>
+              <w:top w:type="dxa" w:w="70"/>
+              <w:left w:type="dxa" w:w="110"/>
+              <w:bottom w:type="dxa" w:w="70"/>
+              <w:right w:type="dxa" w:w="110"/>
+            </w:tcMar>
+            <w:vAlign w:val="top"/>
+          </w:tcPr>
+          <w:p>
+            <w:pPr>
+              <w:spacing w:after="0" w:line="250"/>
+              <w:jc w:val="left"/>
+            </w:pPr>
+            <w:r>
+              <w:rPr>
+                <w:rFonts w:ascii="Calibri" w:cs="Calibri" w:eastAsia="Calibri" w:hAnsi="Calibri"/>
+                <w:b/>
+                <w:bCs/>
+                <w:color w:val="8C3A2B"/>
+                <w:sz w:val="18"/>
+                <w:szCs w:val="18"/>
+              </w:rPr>
               <w:t xml:space="preserve">FİNAL JÜRİSİ</w:t>
             </w:r>
           </w:p>
@@ -6528,7 +6600,7 @@
           <w:sz w:val="17"/>
           <w:szCs w:val="17"/>
         </w:rPr>
-        <w:t xml:space="preserve">10 Kasım Atatürk'ü Anma Günü'dür; ders 09.05 töreninin ardından başlar.</w:t>
+        <w:t xml:space="preserve">Her ders günü en az bir kritik alınması ve o hafta için belirtilen teslimin yapılması zorunludur.</w:t>
       </w:r>
     </w:p>
     <w:p>
@@ -6918,7 +6990,7 @@
                 <w:sz w:val="18"/>
                 <w:szCs w:val="18"/>
               </w:rPr>
-              <w:t xml:space="preserve">A</w:t>
+              <w:t xml:space="preserve">AA</w:t>
             </w:r>
           </w:p>
         </w:tc>
@@ -6946,7 +7018,7 @@
                 <w:sz w:val="18"/>
                 <w:szCs w:val="18"/>
               </w:rPr>
-              <w:t xml:space="preserve">89–85</w:t>
+              <w:t xml:space="preserve">89–80</w:t>
             </w:r>
           </w:p>
         </w:tc>
@@ -6975,7 +7047,7 @@
                 <w:sz w:val="18"/>
                 <w:szCs w:val="18"/>
               </w:rPr>
-              <w:t xml:space="preserve">A−</w:t>
+              <w:t xml:space="preserve">BA</w:t>
             </w:r>
           </w:p>
         </w:tc>
@@ -7003,7 +7075,7 @@
                 <w:sz w:val="18"/>
                 <w:szCs w:val="18"/>
               </w:rPr>
-              <w:t xml:space="preserve">84–80</w:t>
+              <w:t xml:space="preserve">79–70</w:t>
             </w:r>
           </w:p>
         </w:tc>
@@ -7032,7 +7104,7 @@
                 <w:sz w:val="18"/>
                 <w:szCs w:val="18"/>
               </w:rPr>
-              <w:t xml:space="preserve">B+</w:t>
+              <w:t xml:space="preserve">BB</w:t>
             </w:r>
           </w:p>
         </w:tc>
@@ -7060,7 +7132,7 @@
                 <w:sz w:val="18"/>
                 <w:szCs w:val="18"/>
               </w:rPr>
-              <w:t xml:space="preserve">79–75</w:t>
+              <w:t xml:space="preserve">69–65</w:t>
             </w:r>
           </w:p>
         </w:tc>
@@ -7089,7 +7161,7 @@
                 <w:sz w:val="18"/>
                 <w:szCs w:val="18"/>
               </w:rPr>
-              <w:t xml:space="preserve">B</w:t>
+              <w:t xml:space="preserve">CB</w:t>
             </w:r>
           </w:p>
         </w:tc>
@@ -7119,7 +7191,7 @@
                 <w:sz w:val="18"/>
                 <w:szCs w:val="18"/>
               </w:rPr>
-              <w:t xml:space="preserve">74–70</w:t>
+              <w:t xml:space="preserve">64–60</w:t>
             </w:r>
           </w:p>
         </w:tc>
@@ -7148,7 +7220,7 @@
                 <w:sz w:val="18"/>
                 <w:szCs w:val="18"/>
               </w:rPr>
-              <w:t xml:space="preserve">B−</w:t>
+              <w:t xml:space="preserve">CC</w:t>
             </w:r>
           </w:p>
         </w:tc>
@@ -7176,7 +7248,7 @@
                 <w:sz w:val="18"/>
                 <w:szCs w:val="18"/>
               </w:rPr>
-              <w:t xml:space="preserve">69–65</w:t>
+              <w:t xml:space="preserve">59–55</w:t>
             </w:r>
           </w:p>
         </w:tc>
@@ -7205,7 +7277,7 @@
                 <w:sz w:val="18"/>
                 <w:szCs w:val="18"/>
               </w:rPr>
-              <w:t xml:space="preserve">C+</w:t>
+              <w:t xml:space="preserve">DC</w:t>
             </w:r>
           </w:p>
         </w:tc>
@@ -7233,7 +7305,7 @@
                 <w:sz w:val="18"/>
                 <w:szCs w:val="18"/>
               </w:rPr>
-              <w:t xml:space="preserve">64–60</w:t>
+              <w:t xml:space="preserve">54–50</w:t>
             </w:r>
           </w:p>
         </w:tc>
@@ -7262,7 +7334,7 @@
                 <w:sz w:val="18"/>
                 <w:szCs w:val="18"/>
               </w:rPr>
-              <w:t xml:space="preserve">C</w:t>
+              <w:t xml:space="preserve">DD</w:t>
             </w:r>
           </w:p>
         </w:tc>
@@ -7290,7 +7362,7 @@
                 <w:sz w:val="18"/>
                 <w:szCs w:val="18"/>
               </w:rPr>
-              <w:t xml:space="preserve">59–55</w:t>
+              <w:t xml:space="preserve">49–40</w:t>
             </w:r>
           </w:p>
         </w:tc>
@@ -7319,7 +7391,7 @@
                 <w:sz w:val="18"/>
                 <w:szCs w:val="18"/>
               </w:rPr>
-              <w:t xml:space="preserve">C−</w:t>
+              <w:t xml:space="preserve">FD</w:t>
             </w:r>
           </w:p>
         </w:tc>
@@ -7349,7 +7421,7 @@
                 <w:sz w:val="18"/>
                 <w:szCs w:val="18"/>
               </w:rPr>
-              <w:t xml:space="preserve">54–50</w:t>
+              <w:t xml:space="preserve">39–0</w:t>
             </w:r>
           </w:p>
         </w:tc>
@@ -7378,7 +7450,7 @@
                 <w:sz w:val="18"/>
                 <w:szCs w:val="18"/>
               </w:rPr>
-              <w:t xml:space="preserve">D+</w:t>
+              <w:t xml:space="preserve">FF</w:t>
             </w:r>
           </w:p>
         </w:tc>
@@ -7397,7 +7469,7 @@
           <w:p>
             <w:pPr>
               <w:spacing w:after="0" w:line="250"/>
-              <w:jc w:val="center"/>
+              <w:jc w:val="left"/>
             </w:pPr>
             <w:r>
               <w:rPr>
@@ -7406,7 +7478,7 @@
                 <w:sz w:val="18"/>
                 <w:szCs w:val="18"/>
               </w:rPr>
-              <w:t xml:space="preserve">49–45</w:t>
+              <w:t xml:space="preserve"/>
             </w:r>
           </w:p>
         </w:tc>
@@ -7424,18 +7496,16 @@
           <w:p>
             <w:pPr>
               <w:spacing w:after="0" w:line="250"/>
-              <w:jc w:val="center"/>
-            </w:pPr>
-            <w:r>
-              <w:rPr>
-                <w:rFonts w:ascii="Calibri" w:cs="Calibri" w:eastAsia="Calibri" w:hAnsi="Calibri"/>
-                <w:b/>
-                <w:bCs/>
+              <w:jc w:val="left"/>
+            </w:pPr>
+            <w:r>
+              <w:rPr>
+                <w:rFonts w:ascii="Calibri" w:cs="Calibri" w:eastAsia="Calibri" w:hAnsi="Calibri"/>
                 <w:color w:val="1A1A1A"/>
                 <w:sz w:val="18"/>
                 <w:szCs w:val="18"/>
               </w:rPr>
-              <w:t xml:space="preserve">D</w:t>
+              <w:t xml:space="preserve"/>
             </w:r>
           </w:p>
         </w:tc>
@@ -7454,7 +7524,7 @@
           <w:p>
             <w:pPr>
               <w:spacing w:after="0" w:line="250"/>
-              <w:jc w:val="center"/>
+              <w:jc w:val="left"/>
             </w:pPr>
             <w:r>
               <w:rPr>
@@ -7463,7 +7533,7 @@
                 <w:sz w:val="18"/>
                 <w:szCs w:val="18"/>
               </w:rPr>
-              <w:t xml:space="preserve">44–0</w:t>
+              <w:t xml:space="preserve"/>
             </w:r>
           </w:p>
         </w:tc>
@@ -7481,18 +7551,16 @@
           <w:p>
             <w:pPr>
               <w:spacing w:after="0" w:line="250"/>
-              <w:jc w:val="center"/>
-            </w:pPr>
-            <w:r>
-              <w:rPr>
-                <w:rFonts w:ascii="Calibri" w:cs="Calibri" w:eastAsia="Calibri" w:hAnsi="Calibri"/>
-                <w:b/>
-                <w:bCs/>
+              <w:jc w:val="left"/>
+            </w:pPr>
+            <w:r>
+              <w:rPr>
+                <w:rFonts w:ascii="Calibri" w:cs="Calibri" w:eastAsia="Calibri" w:hAnsi="Calibri"/>
                 <w:color w:val="1A1A1A"/>
                 <w:sz w:val="18"/>
                 <w:szCs w:val="18"/>
               </w:rPr>
-              <w:t xml:space="preserve">F</w:t>
+              <w:t xml:space="preserve"/>
             </w:r>
           </w:p>
         </w:tc>
@@ -7560,7 +7628,7 @@
     </w:p>
     <w:p>
       <w:pPr>
-        <w:spacing w:after="100" w:before="0" w:line="276"/>
+        <w:spacing w:after="40" w:before="0" w:line="276"/>
         <w:jc w:val="left"/>
       </w:pPr>
       <w:r>
@@ -7574,7 +7642,45 @@
           <w:sz w:val="17"/>
           <w:szCs w:val="17"/>
         </w:rPr>
-        <w:t xml:space="preserve">Ders başarı notu / Harf notu karşılıkları. Ders kapsamında şüpheli bir durum oluşması hâlinde ek ölçme ve değerlendirme yöntemleri uygulanır.</w:t>
+        <w:t xml:space="preserve">Ders başarı notu / Harf notu karşılıkları.</w:t>
+      </w:r>
+    </w:p>
+    <w:p>
+      <w:pPr>
+        <w:spacing w:after="40" w:before="0" w:line="276"/>
+        <w:jc w:val="left"/>
+      </w:pPr>
+      <w:r>
+        <w:rPr>
+          <w:rFonts w:ascii="Calibri" w:cs="Calibri" w:eastAsia="Calibri" w:hAnsi="Calibri"/>
+          <w:b/>
+          <w:bCs/>
+          <w:i w:val="false"/>
+          <w:iCs w:val="false"/>
+          <w:color w:val="8C3A2B"/>
+          <w:sz w:val="19"/>
+          <w:szCs w:val="19"/>
+        </w:rPr>
+        <w:t xml:space="preserve">Dersten başarılı sayılmak için en az 60 puan (CC) alınması zorunludur.</w:t>
+      </w:r>
+    </w:p>
+    <w:p>
+      <w:pPr>
+        <w:spacing w:after="100" w:before="0" w:line="276"/>
+        <w:jc w:val="left"/>
+      </w:pPr>
+      <w:r>
+        <w:rPr>
+          <w:rFonts w:ascii="Calibri" w:cs="Calibri" w:eastAsia="Calibri" w:hAnsi="Calibri"/>
+          <w:b w:val="false"/>
+          <w:bCs w:val="false"/>
+          <w:i/>
+          <w:iCs/>
+          <w:color w:val="5A6270"/>
+          <w:sz w:val="17"/>
+          <w:szCs w:val="17"/>
+        </w:rPr>
+        <w:t xml:space="preserve">Harf notu aralıkları üniversitenin yürürlükteki ölçme ve değerlendirme yönetmeliğine göre uygulanır. Ders kapsamında şüpheli bir durum oluşması hâlinde ek ölçme ve değerlendirme yöntemleri uygulanır.</w:t>
       </w:r>
     </w:p>
     <w:p>

</xml_diff>